<commit_message>
Add more statistical data to resume
</commit_message>
<xml_diff>
--- a/static/Omid Reza Heidari-Resume.docx
+++ b/static/Omid Reza Heidari-Resume.docx
@@ -544,6 +544,15 @@
           <w:szCs w:val="20"/>
           <w:lang w:bidi="fa-IR"/>
         </w:rPr>
+        <w:t xml:space="preserve"> – May 2020</w:t>
+      </w:r>
+      <w:r>
+        <w:rPr>
+          <w:rFonts w:asciiTheme="minorBidi" w:hAnsiTheme="minorBidi"/>
+          <w:sz w:val="20"/>
+          <w:szCs w:val="20"/>
+          <w:lang w:bidi="fa-IR"/>
+        </w:rPr>
         <w:tab/>
       </w:r>
       <w:r>
@@ -643,7 +652,23 @@
           <w:sz w:val="20"/>
           <w:szCs w:val="20"/>
         </w:rPr>
-        <w:t xml:space="preserve">as well as connecting it </w:t>
+        <w:t xml:space="preserve">as well as </w:t>
+      </w:r>
+      <w:r>
+        <w:rPr>
+          <w:rFonts w:asciiTheme="minorBidi" w:hAnsiTheme="minorBidi"/>
+          <w:sz w:val="20"/>
+          <w:szCs w:val="20"/>
+        </w:rPr>
+        <w:t>connect</w:t>
+      </w:r>
+      <w:r>
+        <w:rPr>
+          <w:rFonts w:asciiTheme="minorBidi" w:hAnsiTheme="minorBidi"/>
+          <w:sz w:val="20"/>
+          <w:szCs w:val="20"/>
+        </w:rPr>
+        <w:t xml:space="preserve"> it </w:t>
       </w:r>
       <w:r>
         <w:rPr>
@@ -691,7 +716,103 @@
           <w:sz w:val="20"/>
           <w:szCs w:val="20"/>
         </w:rPr>
-        <w:t>-person</w:t>
+        <w:t xml:space="preserve"> </w:t>
+      </w:r>
+      <w:r>
+        <w:rPr>
+          <w:rFonts w:asciiTheme="minorBidi" w:hAnsiTheme="minorBidi"/>
+          <w:sz w:val="20"/>
+          <w:szCs w:val="20"/>
+        </w:rPr>
+        <w:t>pers</w:t>
+      </w:r>
+      <w:r>
+        <w:rPr>
+          <w:rFonts w:asciiTheme="minorBidi" w:hAnsiTheme="minorBidi"/>
+          <w:sz w:val="20"/>
+          <w:szCs w:val="20"/>
+        </w:rPr>
+        <w:t>on</w:t>
+      </w:r>
+      <w:r>
+        <w:rPr>
+          <w:rFonts w:asciiTheme="minorBidi" w:hAnsiTheme="minorBidi"/>
+          <w:sz w:val="20"/>
+          <w:szCs w:val="20"/>
+        </w:rPr>
+        <w:t>, which</w:t>
+      </w:r>
+      <w:r>
+        <w:rPr>
+          <w:rFonts w:asciiTheme="minorBidi" w:hAnsiTheme="minorBidi"/>
+          <w:sz w:val="20"/>
+          <w:szCs w:val="20"/>
+        </w:rPr>
+        <w:t xml:space="preserve"> </w:t>
+      </w:r>
+      <w:r>
+        <w:rPr>
+          <w:rFonts w:asciiTheme="minorBidi" w:hAnsiTheme="minorBidi"/>
+          <w:sz w:val="20"/>
+          <w:szCs w:val="20"/>
+        </w:rPr>
+        <w:t xml:space="preserve">decreased </w:t>
+      </w:r>
+      <w:r>
+        <w:rPr>
+          <w:rFonts w:asciiTheme="minorBidi" w:hAnsiTheme="minorBidi"/>
+          <w:sz w:val="20"/>
+          <w:szCs w:val="20"/>
+        </w:rPr>
+        <w:t>the</w:t>
+      </w:r>
+      <w:r>
+        <w:rPr>
+          <w:rFonts w:asciiTheme="minorBidi" w:hAnsiTheme="minorBidi"/>
+          <w:sz w:val="20"/>
+          <w:szCs w:val="20"/>
+        </w:rPr>
+        <w:t xml:space="preserve"> time of refund process from about 2 business days</w:t>
+      </w:r>
+      <w:r>
+        <w:rPr>
+          <w:rFonts w:asciiTheme="minorBidi" w:hAnsiTheme="minorBidi"/>
+          <w:sz w:val="20"/>
+          <w:szCs w:val="20"/>
+        </w:rPr>
+        <w:t xml:space="preserve">, due to manual refund through </w:t>
+      </w:r>
+      <w:r>
+        <w:rPr>
+          <w:rFonts w:asciiTheme="minorBidi" w:hAnsiTheme="minorBidi"/>
+          <w:sz w:val="20"/>
+          <w:szCs w:val="20"/>
+        </w:rPr>
+        <w:t xml:space="preserve">the </w:t>
+      </w:r>
+      <w:r>
+        <w:rPr>
+          <w:rFonts w:asciiTheme="minorBidi" w:hAnsiTheme="minorBidi"/>
+          <w:sz w:val="20"/>
+          <w:szCs w:val="20"/>
+        </w:rPr>
+        <w:t>bank panel,</w:t>
+      </w:r>
+      <w:r>
+        <w:rPr>
+          <w:rFonts w:asciiTheme="minorBidi" w:hAnsiTheme="minorBidi"/>
+          <w:sz w:val="20"/>
+          <w:szCs w:val="20"/>
+        </w:rPr>
+        <w:t xml:space="preserve"> </w:t>
+      </w:r>
+      <w:r>
+        <w:rPr>
+          <w:rFonts w:asciiTheme="minorBidi" w:hAnsiTheme="minorBidi"/>
+          <w:sz w:val="20"/>
+          <w:szCs w:val="20"/>
+        </w:rPr>
+        <w:t>to less than 3 hours</w:t>
       </w:r>
     </w:p>
     <w:p>
@@ -851,6 +972,14 @@
         </w:rPr>
         <w:t xml:space="preserve"> purchases</w:t>
       </w:r>
+      <w:r>
+        <w:rPr>
+          <w:rFonts w:asciiTheme="minorBidi" w:hAnsiTheme="minorBidi"/>
+          <w:sz w:val="20"/>
+          <w:szCs w:val="20"/>
+        </w:rPr>
+        <w:t>, which reduced the response time of admins to users (sellers and customers) by 13 seconds on average</w:t>
+      </w:r>
     </w:p>
     <w:p>
       <w:pPr>
@@ -882,6 +1011,70 @@
         </w:rPr>
         <w:t xml:space="preserve"> in Laravel migration and model files</w:t>
       </w:r>
+      <w:r>
+        <w:rPr>
+          <w:rFonts w:asciiTheme="minorBidi" w:hAnsiTheme="minorBidi"/>
+          <w:sz w:val="20"/>
+          <w:szCs w:val="20"/>
+        </w:rPr>
+        <w:t xml:space="preserve">, which </w:t>
+      </w:r>
+      <w:r>
+        <w:rPr>
+          <w:rFonts w:asciiTheme="minorBidi" w:hAnsiTheme="minorBidi"/>
+          <w:sz w:val="20"/>
+          <w:szCs w:val="20"/>
+        </w:rPr>
+        <w:t xml:space="preserve">reduced </w:t>
+      </w:r>
+      <w:r>
+        <w:rPr>
+          <w:rFonts w:asciiTheme="minorBidi" w:hAnsiTheme="minorBidi"/>
+          <w:sz w:val="20"/>
+          <w:szCs w:val="20"/>
+        </w:rPr>
+        <w:t>the response time by about 10%</w:t>
+      </w:r>
+      <w:r>
+        <w:rPr>
+          <w:rFonts w:asciiTheme="minorBidi" w:hAnsiTheme="minorBidi"/>
+          <w:sz w:val="20"/>
+          <w:szCs w:val="20"/>
+        </w:rPr>
+        <w:t xml:space="preserve"> for </w:t>
+      </w:r>
+      <w:r>
+        <w:rPr>
+          <w:rFonts w:asciiTheme="minorBidi" w:hAnsiTheme="minorBidi"/>
+          <w:sz w:val="20"/>
+          <w:szCs w:val="20"/>
+        </w:rPr>
+        <w:t>eight</w:t>
+      </w:r>
+      <w:r>
+        <w:rPr>
+          <w:rFonts w:asciiTheme="minorBidi" w:hAnsiTheme="minorBidi"/>
+          <w:sz w:val="20"/>
+          <w:szCs w:val="20"/>
+        </w:rPr>
+        <w:t>-</w:t>
+      </w:r>
+      <w:r>
+        <w:rPr>
+          <w:rFonts w:asciiTheme="minorBidi" w:hAnsiTheme="minorBidi"/>
+          <w:sz w:val="20"/>
+          <w:szCs w:val="20"/>
+        </w:rPr>
+        <w:t>tenths</w:t>
+      </w:r>
+      <w:r>
+        <w:rPr>
+          <w:rFonts w:asciiTheme="minorBidi" w:hAnsiTheme="minorBidi"/>
+          <w:sz w:val="20"/>
+          <w:szCs w:val="20"/>
+        </w:rPr>
+        <w:t xml:space="preserve"> of the database calls</w:t>
+      </w:r>
     </w:p>
     <w:p>
       <w:pPr>
@@ -1056,7 +1249,87 @@
           <w:sz w:val="20"/>
           <w:szCs w:val="20"/>
         </w:rPr>
-        <w:t xml:space="preserve"> able to rent a game for a period instead of permanently</w:t>
+        <w:t xml:space="preserve"> able to rent a game for a </w:t>
+      </w:r>
+      <w:r>
+        <w:rPr>
+          <w:rFonts w:asciiTheme="minorBidi" w:hAnsiTheme="minorBidi"/>
+          <w:sz w:val="20"/>
+          <w:szCs w:val="20"/>
+        </w:rPr>
+        <w:t xml:space="preserve">limited </w:t>
+      </w:r>
+      <w:r>
+        <w:rPr>
+          <w:rFonts w:asciiTheme="minorBidi" w:hAnsiTheme="minorBidi"/>
+          <w:sz w:val="20"/>
+          <w:szCs w:val="20"/>
+        </w:rPr>
+        <w:t>period instead of permanently</w:t>
+      </w:r>
+      <w:r>
+        <w:rPr>
+          <w:rFonts w:asciiTheme="minorBidi" w:hAnsiTheme="minorBidi"/>
+          <w:sz w:val="20"/>
+          <w:szCs w:val="20"/>
+        </w:rPr>
+        <w:t>, and thus, the income from this feature constitute</w:t>
+      </w:r>
+      <w:r>
+        <w:rPr>
+          <w:rFonts w:asciiTheme="minorBidi" w:hAnsiTheme="minorBidi"/>
+          <w:sz w:val="20"/>
+          <w:szCs w:val="20"/>
+        </w:rPr>
+        <w:t>d</w:t>
+      </w:r>
+      <w:r>
+        <w:rPr>
+          <w:rFonts w:asciiTheme="minorBidi" w:hAnsiTheme="minorBidi"/>
+          <w:sz w:val="20"/>
+          <w:szCs w:val="20"/>
+        </w:rPr>
+        <w:t xml:space="preserve"> almost 30%</w:t>
+      </w:r>
+      <w:r>
+        <w:rPr>
+          <w:rFonts w:asciiTheme="minorBidi" w:hAnsiTheme="minorBidi"/>
+          <w:sz w:val="20"/>
+          <w:szCs w:val="20"/>
+        </w:rPr>
+        <w:t xml:space="preserve">, </w:t>
+      </w:r>
+      <w:r>
+        <w:rPr>
+          <w:rFonts w:asciiTheme="minorBidi" w:hAnsiTheme="minorBidi"/>
+          <w:sz w:val="20"/>
+          <w:szCs w:val="20"/>
+        </w:rPr>
+        <w:t>of overall income</w:t>
+      </w:r>
+      <w:r>
+        <w:rPr>
+          <w:rFonts w:asciiTheme="minorBidi" w:hAnsiTheme="minorBidi"/>
+          <w:sz w:val="20"/>
+          <w:szCs w:val="20"/>
+        </w:rPr>
+        <w:t xml:space="preserve"> </w:t>
+      </w:r>
+      <w:r>
+        <w:rPr>
+          <w:rFonts w:asciiTheme="minorBidi" w:hAnsiTheme="minorBidi"/>
+          <w:sz w:val="20"/>
+          <w:szCs w:val="20"/>
+        </w:rPr>
+        <w:t xml:space="preserve">during </w:t>
+      </w:r>
+      <w:r>
+        <w:rPr>
+          <w:rFonts w:asciiTheme="minorBidi" w:hAnsiTheme="minorBidi"/>
+          <w:sz w:val="20"/>
+          <w:szCs w:val="20"/>
+        </w:rPr>
+        <w:t>the first 6-month period</w:t>
       </w:r>
     </w:p>
     <w:p>
@@ -1098,7 +1371,7 @@
           <w:sz w:val="20"/>
           <w:szCs w:val="20"/>
         </w:rPr>
-        <w:t>customer and sellers</w:t>
+        <w:t>customer</w:t>
       </w:r>
       <w:r>
         <w:rPr>
@@ -1107,7 +1380,142 @@
           <w:sz w:val="20"/>
           <w:szCs w:val="20"/>
         </w:rPr>
-        <w:t xml:space="preserve"> by Email and SMS</w:t>
+        <w:t>s</w:t>
+      </w:r>
+      <w:r>
+        <w:rPr>
+          <w:rStyle w:val="hgkelc"/>
+          <w:rFonts w:asciiTheme="minorBidi" w:hAnsiTheme="minorBidi"/>
+          <w:sz w:val="20"/>
+          <w:szCs w:val="20"/>
+        </w:rPr>
+        <w:t xml:space="preserve"> and sellers</w:t>
+      </w:r>
+      <w:r>
+        <w:rPr>
+          <w:rStyle w:val="hgkelc"/>
+          <w:rFonts w:asciiTheme="minorBidi" w:hAnsiTheme="minorBidi"/>
+          <w:sz w:val="20"/>
+          <w:szCs w:val="20"/>
+        </w:rPr>
+        <w:t xml:space="preserve"> </w:t>
+      </w:r>
+      <w:r>
+        <w:rPr>
+          <w:rStyle w:val="hgkelc"/>
+          <w:rFonts w:asciiTheme="minorBidi" w:hAnsiTheme="minorBidi"/>
+          <w:sz w:val="20"/>
+          <w:szCs w:val="20"/>
+        </w:rPr>
+        <w:t xml:space="preserve">about the processing of renting/purchasing a game </w:t>
+      </w:r>
+      <w:r>
+        <w:rPr>
+          <w:rStyle w:val="hgkelc"/>
+          <w:rFonts w:asciiTheme="minorBidi" w:hAnsiTheme="minorBidi"/>
+          <w:sz w:val="20"/>
+          <w:szCs w:val="20"/>
+        </w:rPr>
+        <w:t xml:space="preserve">by </w:t>
+      </w:r>
+      <w:r>
+        <w:rPr>
+          <w:rStyle w:val="hgkelc"/>
+          <w:rFonts w:asciiTheme="minorBidi" w:hAnsiTheme="minorBidi"/>
+          <w:sz w:val="20"/>
+          <w:szCs w:val="20"/>
+        </w:rPr>
+        <w:t>email</w:t>
+      </w:r>
+      <w:r>
+        <w:rPr>
+          <w:rStyle w:val="hgkelc"/>
+          <w:rFonts w:asciiTheme="minorBidi" w:hAnsiTheme="minorBidi"/>
+          <w:sz w:val="20"/>
+          <w:szCs w:val="20"/>
+        </w:rPr>
+        <w:t xml:space="preserve"> </w:t>
+      </w:r>
+      <w:r>
+        <w:rPr>
+          <w:rStyle w:val="hgkelc"/>
+          <w:rFonts w:asciiTheme="minorBidi" w:hAnsiTheme="minorBidi"/>
+          <w:sz w:val="20"/>
+          <w:szCs w:val="20"/>
+        </w:rPr>
+        <w:t xml:space="preserve">and/or </w:t>
+      </w:r>
+      <w:r>
+        <w:rPr>
+          <w:rStyle w:val="hgkelc"/>
+          <w:rFonts w:asciiTheme="minorBidi" w:hAnsiTheme="minorBidi"/>
+          <w:sz w:val="20"/>
+          <w:szCs w:val="20"/>
+        </w:rPr>
+        <w:t>SMS</w:t>
+      </w:r>
+      <w:r>
+        <w:rPr>
+          <w:rStyle w:val="hgkelc"/>
+          <w:rFonts w:asciiTheme="minorBidi" w:hAnsiTheme="minorBidi"/>
+          <w:sz w:val="20"/>
+          <w:szCs w:val="20"/>
+        </w:rPr>
+        <w:t xml:space="preserve">, and thus, the support contacting </w:t>
+      </w:r>
+      <w:r>
+        <w:rPr>
+          <w:rStyle w:val="hgkelc"/>
+          <w:rFonts w:asciiTheme="minorBidi" w:hAnsiTheme="minorBidi"/>
+          <w:sz w:val="20"/>
+          <w:szCs w:val="20"/>
+        </w:rPr>
+        <w:t>rate</w:t>
+      </w:r>
+      <w:r>
+        <w:rPr>
+          <w:rStyle w:val="hgkelc"/>
+          <w:rFonts w:asciiTheme="minorBidi" w:hAnsiTheme="minorBidi"/>
+          <w:sz w:val="20"/>
+          <w:szCs w:val="20"/>
+        </w:rPr>
+        <w:t xml:space="preserve"> that was about inquiring</w:t>
+      </w:r>
+      <w:r>
+        <w:rPr>
+          <w:rStyle w:val="hgkelc"/>
+          <w:rFonts w:asciiTheme="minorBidi" w:hAnsiTheme="minorBidi"/>
+          <w:sz w:val="20"/>
+          <w:szCs w:val="20"/>
+        </w:rPr>
+        <w:t xml:space="preserve"> about</w:t>
+      </w:r>
+      <w:r>
+        <w:rPr>
+          <w:rStyle w:val="hgkelc"/>
+          <w:rFonts w:asciiTheme="minorBidi" w:hAnsiTheme="minorBidi"/>
+          <w:sz w:val="20"/>
+          <w:szCs w:val="20"/>
+        </w:rPr>
+        <w:t xml:space="preserve"> the process of renting/purchasing diminished by </w:t>
+      </w:r>
+      <w:r>
+        <w:rPr>
+          <w:rStyle w:val="hgkelc"/>
+          <w:rFonts w:asciiTheme="minorBidi" w:hAnsiTheme="minorBidi"/>
+          <w:sz w:val="20"/>
+          <w:szCs w:val="20"/>
+        </w:rPr>
+        <w:t xml:space="preserve">just </w:t>
+      </w:r>
+      <w:r>
+        <w:rPr>
+          <w:rStyle w:val="hgkelc"/>
+          <w:rFonts w:asciiTheme="minorBidi" w:hAnsiTheme="minorBidi"/>
+          <w:sz w:val="20"/>
+          <w:szCs w:val="20"/>
+        </w:rPr>
+        <w:t>95%</w:t>
       </w:r>
     </w:p>
     <w:p>
@@ -1176,7 +1584,7 @@
           <w:sz w:val="20"/>
           <w:szCs w:val="20"/>
         </w:rPr>
-        <w:t xml:space="preserve">which user could customize their search to achieve the </w:t>
+        <w:t xml:space="preserve">which user could customize their search to achieve </w:t>
       </w:r>
       <w:r>
         <w:rPr>
@@ -1195,6 +1603,15 @@
           <w:szCs w:val="20"/>
         </w:rPr>
         <w:t>accurate results</w:t>
+      </w:r>
+      <w:r>
+        <w:rPr>
+          <w:rStyle w:val="hgkelc"/>
+          <w:rFonts w:asciiTheme="minorBidi" w:hAnsiTheme="minorBidi"/>
+          <w:sz w:val="20"/>
+          <w:szCs w:val="20"/>
+        </w:rPr>
+        <w:t>, resulting in 6% more item views through the search process</w:t>
       </w:r>
     </w:p>
     <w:p>
@@ -1272,6 +1689,8 @@
           <w:rPr>
             <w:rStyle w:val="Hyperlink"/>
             <w:rFonts w:asciiTheme="minorBidi" w:hAnsiTheme="minorBidi"/>
+            <w:b/>
+            <w:bCs/>
             <w:color w:val="1F3864" w:themeColor="accent1" w:themeShade="80"/>
             <w:sz w:val="20"/>
             <w:szCs w:val="20"/>
@@ -1608,6 +2027,8 @@
           <w:rPr>
             <w:rStyle w:val="Hyperlink"/>
             <w:rFonts w:asciiTheme="minorBidi" w:hAnsiTheme="minorBidi"/>
+            <w:b/>
+            <w:bCs/>
             <w:color w:val="1F3864" w:themeColor="accent1" w:themeShade="80"/>
             <w:sz w:val="20"/>
             <w:szCs w:val="20"/>
@@ -1692,6 +2113,7 @@
           <w:szCs w:val="20"/>
           <w:lang w:bidi="fa-IR"/>
         </w:rPr>
+        <w:lastRenderedPageBreak/>
         <w:t xml:space="preserve">The project has been </w:t>
       </w:r>
       <w:r>
@@ -1941,6 +2363,8 @@
           <w:rPr>
             <w:rStyle w:val="Hyperlink"/>
             <w:rFonts w:asciiTheme="minorBidi" w:hAnsiTheme="minorBidi"/>
+            <w:b/>
+            <w:bCs/>
             <w:color w:val="1F3864" w:themeColor="accent1" w:themeShade="80"/>
             <w:sz w:val="20"/>
             <w:szCs w:val="20"/>
@@ -2064,7 +2488,6 @@
           <w:szCs w:val="20"/>
           <w:lang w:bidi="fa-IR"/>
         </w:rPr>
-        <w:lastRenderedPageBreak/>
         <w:t>2</w:t>
       </w:r>
       <w:r>
@@ -2131,6 +2554,8 @@
           <w:rPr>
             <w:rStyle w:val="Hyperlink"/>
             <w:rFonts w:asciiTheme="minorBidi" w:hAnsiTheme="minorBidi"/>
+            <w:b/>
+            <w:bCs/>
             <w:color w:val="1F3864" w:themeColor="accent1" w:themeShade="80"/>
             <w:sz w:val="20"/>
             <w:szCs w:val="20"/>
@@ -2361,16 +2786,23 @@
     </w:p>
     <w:p>
       <w:pPr>
-        <w:tabs>
-          <w:tab w:val="left" w:pos="1996"/>
-        </w:tabs>
+        <w:spacing w:line="276" w:lineRule="auto"/>
+        <w:rPr>
+          <w:rFonts w:asciiTheme="minorBidi" w:hAnsiTheme="minorBidi"/>
+          <w:sz w:val="2"/>
+          <w:szCs w:val="2"/>
+        </w:rPr>
+      </w:pPr>
+    </w:p>
+    <w:p>
+      <w:pPr>
+        <w:spacing w:line="276" w:lineRule="auto"/>
         <w:rPr>
           <w:rFonts w:asciiTheme="minorBidi" w:hAnsiTheme="minorBidi"/>
           <w:b/>
           <w:bCs/>
           <w:sz w:val="24"/>
           <w:szCs w:val="24"/>
-          <w:lang w:bidi="fa-IR"/>
         </w:rPr>
       </w:pPr>
       <w:r>
@@ -2380,9 +2812,653 @@
           <w:bCs/>
           <w:sz w:val="24"/>
           <w:szCs w:val="24"/>
-          <w:lang w:bidi="fa-IR"/>
-        </w:rPr>
-        <w:t>TECHNICAL SKILLS</w:t>
+        </w:rPr>
+        <w:t>EDUCATION</w:t>
+      </w:r>
+    </w:p>
+    <w:p>
+      <w:pPr>
+        <w:spacing w:line="240" w:lineRule="auto"/>
+        <w:rPr>
+          <w:rFonts w:asciiTheme="minorBidi" w:hAnsiTheme="minorBidi"/>
+          <w:b/>
+          <w:bCs/>
+          <w:sz w:val="20"/>
+          <w:szCs w:val="20"/>
+        </w:rPr>
+      </w:pPr>
+      <w:bookmarkStart w:id="0" w:name="_Hlk92315511"/>
+      <w:r>
+        <w:rPr>
+          <w:rFonts w:asciiTheme="minorBidi" w:hAnsiTheme="minorBidi"/>
+          <w:sz w:val="20"/>
+          <w:szCs w:val="20"/>
+        </w:rPr>
+        <w:t>20</w:t>
+      </w:r>
+      <w:r>
+        <w:rPr>
+          <w:rFonts w:asciiTheme="minorBidi" w:hAnsiTheme="minorBidi"/>
+          <w:sz w:val="20"/>
+          <w:szCs w:val="20"/>
+        </w:rPr>
+        <w:t>23</w:t>
+      </w:r>
+      <w:r>
+        <w:rPr>
+          <w:rFonts w:asciiTheme="minorBidi" w:hAnsiTheme="minorBidi"/>
+          <w:sz w:val="20"/>
+          <w:szCs w:val="20"/>
+        </w:rPr>
+        <w:t xml:space="preserve"> - </w:t>
+      </w:r>
+      <w:r>
+        <w:rPr>
+          <w:rFonts w:asciiTheme="minorBidi" w:hAnsiTheme="minorBidi"/>
+          <w:sz w:val="20"/>
+          <w:szCs w:val="20"/>
+        </w:rPr>
+        <w:t>Present</w:t>
+      </w:r>
+      <w:r>
+        <w:rPr>
+          <w:rFonts w:asciiTheme="minorBidi" w:hAnsiTheme="minorBidi"/>
+          <w:sz w:val="20"/>
+          <w:szCs w:val="20"/>
+        </w:rPr>
+        <w:tab/>
+      </w:r>
+      <w:r>
+        <w:rPr>
+          <w:rFonts w:asciiTheme="minorBidi" w:hAnsiTheme="minorBidi"/>
+          <w:b/>
+          <w:bCs/>
+          <w:sz w:val="20"/>
+          <w:szCs w:val="20"/>
+        </w:rPr>
+        <w:t>Master of Computer Science</w:t>
+      </w:r>
+      <w:r>
+        <w:rPr>
+          <w:rFonts w:asciiTheme="minorBidi" w:hAnsiTheme="minorBidi"/>
+          <w:b/>
+          <w:bCs/>
+          <w:sz w:val="20"/>
+          <w:szCs w:val="20"/>
+        </w:rPr>
+        <w:t xml:space="preserve"> </w:t>
+      </w:r>
+    </w:p>
+    <w:p>
+      <w:pPr>
+        <w:spacing w:line="240" w:lineRule="auto"/>
+        <w:ind w:left="720" w:firstLine="720"/>
+        <w:rPr>
+          <w:rFonts w:asciiTheme="minorBidi" w:hAnsiTheme="minorBidi"/>
+          <w:sz w:val="20"/>
+          <w:szCs w:val="20"/>
+        </w:rPr>
+      </w:pPr>
+      <w:r>
+        <w:rPr>
+          <w:rFonts w:asciiTheme="minorBidi" w:hAnsiTheme="minorBidi"/>
+          <w:sz w:val="20"/>
+          <w:szCs w:val="20"/>
+        </w:rPr>
+        <w:t>Concordia University</w:t>
+      </w:r>
+      <w:r>
+        <w:rPr>
+          <w:rFonts w:asciiTheme="minorBidi" w:hAnsiTheme="minorBidi"/>
+          <w:sz w:val="20"/>
+          <w:szCs w:val="20"/>
+        </w:rPr>
+        <w:t xml:space="preserve">, </w:t>
+      </w:r>
+      <w:r>
+        <w:rPr>
+          <w:rFonts w:asciiTheme="minorBidi" w:hAnsiTheme="minorBidi"/>
+          <w:sz w:val="20"/>
+          <w:szCs w:val="20"/>
+        </w:rPr>
+        <w:t>Montréal</w:t>
+      </w:r>
+      <w:r>
+        <w:rPr>
+          <w:rFonts w:asciiTheme="minorBidi" w:hAnsiTheme="minorBidi"/>
+          <w:sz w:val="20"/>
+          <w:szCs w:val="20"/>
+        </w:rPr>
+        <w:t xml:space="preserve">, </w:t>
+      </w:r>
+      <w:r>
+        <w:rPr>
+          <w:rFonts w:asciiTheme="minorBidi" w:hAnsiTheme="minorBidi"/>
+          <w:sz w:val="20"/>
+          <w:szCs w:val="20"/>
+        </w:rPr>
+        <w:t>Québec</w:t>
+      </w:r>
+      <w:r>
+        <w:rPr>
+          <w:rFonts w:asciiTheme="minorBidi" w:hAnsiTheme="minorBidi"/>
+          <w:sz w:val="20"/>
+          <w:szCs w:val="20"/>
+        </w:rPr>
+        <w:t>,</w:t>
+      </w:r>
+      <w:r>
+        <w:rPr>
+          <w:rFonts w:asciiTheme="minorBidi" w:hAnsiTheme="minorBidi"/>
+          <w:sz w:val="20"/>
+          <w:szCs w:val="20"/>
+        </w:rPr>
+        <w:t xml:space="preserve"> </w:t>
+      </w:r>
+      <w:r>
+        <w:rPr>
+          <w:rFonts w:asciiTheme="minorBidi" w:hAnsiTheme="minorBidi"/>
+          <w:sz w:val="20"/>
+          <w:szCs w:val="20"/>
+        </w:rPr>
+        <w:t>Canada</w:t>
+      </w:r>
+    </w:p>
+    <w:p>
+      <w:pPr>
+        <w:spacing w:line="276" w:lineRule="auto"/>
+        <w:rPr>
+          <w:rFonts w:asciiTheme="minorBidi" w:hAnsiTheme="minorBidi"/>
+          <w:b/>
+          <w:bCs/>
+          <w:sz w:val="20"/>
+          <w:szCs w:val="20"/>
+        </w:rPr>
+      </w:pPr>
+      <w:r>
+        <w:rPr>
+          <w:rFonts w:asciiTheme="minorBidi" w:hAnsiTheme="minorBidi"/>
+          <w:sz w:val="20"/>
+          <w:szCs w:val="20"/>
+        </w:rPr>
+        <w:t>2020</w:t>
+      </w:r>
+      <w:r>
+        <w:rPr>
+          <w:rFonts w:asciiTheme="minorBidi" w:hAnsiTheme="minorBidi"/>
+          <w:sz w:val="20"/>
+          <w:szCs w:val="20"/>
+        </w:rPr>
+        <w:t xml:space="preserve"> </w:t>
+      </w:r>
+      <w:r>
+        <w:rPr>
+          <w:rFonts w:asciiTheme="minorBidi" w:hAnsiTheme="minorBidi"/>
+          <w:sz w:val="20"/>
+          <w:szCs w:val="20"/>
+        </w:rPr>
+        <w:t>-</w:t>
+      </w:r>
+      <w:r>
+        <w:rPr>
+          <w:rFonts w:asciiTheme="minorBidi" w:hAnsiTheme="minorBidi"/>
+          <w:sz w:val="20"/>
+          <w:szCs w:val="20"/>
+        </w:rPr>
+        <w:t xml:space="preserve"> </w:t>
+      </w:r>
+      <w:r>
+        <w:rPr>
+          <w:rFonts w:asciiTheme="minorBidi" w:hAnsiTheme="minorBidi"/>
+          <w:sz w:val="20"/>
+          <w:szCs w:val="20"/>
+        </w:rPr>
+        <w:t>2022</w:t>
+      </w:r>
+      <w:r>
+        <w:rPr>
+          <w:rFonts w:asciiTheme="minorBidi" w:hAnsiTheme="minorBidi"/>
+          <w:b/>
+          <w:bCs/>
+          <w:sz w:val="20"/>
+          <w:szCs w:val="20"/>
+        </w:rPr>
+        <w:t xml:space="preserve"> </w:t>
+      </w:r>
+      <w:r>
+        <w:rPr>
+          <w:rFonts w:asciiTheme="minorBidi" w:hAnsiTheme="minorBidi"/>
+          <w:b/>
+          <w:bCs/>
+          <w:sz w:val="20"/>
+          <w:szCs w:val="20"/>
+        </w:rPr>
+        <w:tab/>
+      </w:r>
+      <w:r>
+        <w:rPr>
+          <w:rFonts w:asciiTheme="minorBidi" w:hAnsiTheme="minorBidi"/>
+          <w:b/>
+          <w:bCs/>
+          <w:sz w:val="20"/>
+          <w:szCs w:val="20"/>
+        </w:rPr>
+        <w:t>Bachelor of Computer Engineering</w:t>
+      </w:r>
+    </w:p>
+    <w:bookmarkEnd w:id="0"/>
+    <w:p>
+      <w:pPr>
+        <w:spacing w:line="240" w:lineRule="auto"/>
+        <w:ind w:left="1440"/>
+        <w:rPr>
+          <w:rFonts w:asciiTheme="minorBidi" w:hAnsiTheme="minorBidi"/>
+          <w:sz w:val="20"/>
+          <w:szCs w:val="20"/>
+        </w:rPr>
+      </w:pPr>
+      <w:r>
+        <w:rPr>
+          <w:rFonts w:asciiTheme="minorBidi" w:hAnsiTheme="minorBidi"/>
+          <w:sz w:val="20"/>
+          <w:szCs w:val="20"/>
+        </w:rPr>
+        <w:t xml:space="preserve">Islamic </w:t>
+      </w:r>
+      <w:r>
+        <w:rPr>
+          <w:rFonts w:asciiTheme="minorBidi" w:hAnsiTheme="minorBidi"/>
+          <w:sz w:val="20"/>
+          <w:szCs w:val="20"/>
+        </w:rPr>
+        <w:t>Azad University</w:t>
+      </w:r>
+      <w:r>
+        <w:rPr>
+          <w:rFonts w:asciiTheme="minorBidi" w:hAnsiTheme="minorBidi"/>
+          <w:sz w:val="20"/>
+          <w:szCs w:val="20"/>
+        </w:rPr>
+        <w:t>, Zanjan,</w:t>
+      </w:r>
+      <w:r>
+        <w:rPr>
+          <w:rFonts w:asciiTheme="minorBidi" w:hAnsiTheme="minorBidi"/>
+          <w:sz w:val="20"/>
+          <w:szCs w:val="20"/>
+        </w:rPr>
+        <w:t xml:space="preserve"> </w:t>
+      </w:r>
+      <w:r>
+        <w:rPr>
+          <w:rFonts w:asciiTheme="minorBidi" w:hAnsiTheme="minorBidi"/>
+          <w:sz w:val="20"/>
+          <w:szCs w:val="20"/>
+        </w:rPr>
+        <w:t>Zanjan</w:t>
+      </w:r>
+      <w:r>
+        <w:rPr>
+          <w:rFonts w:asciiTheme="minorBidi" w:hAnsiTheme="minorBidi"/>
+          <w:sz w:val="20"/>
+          <w:szCs w:val="20"/>
+        </w:rPr>
+        <w:t>,</w:t>
+      </w:r>
+      <w:r>
+        <w:rPr>
+          <w:rFonts w:asciiTheme="minorBidi" w:hAnsiTheme="minorBidi"/>
+          <w:sz w:val="20"/>
+          <w:szCs w:val="20"/>
+        </w:rPr>
+        <w:t xml:space="preserve"> Iran</w:t>
+      </w:r>
+    </w:p>
+    <w:p>
+      <w:pPr>
+        <w:spacing w:line="240" w:lineRule="auto"/>
+        <w:ind w:left="720" w:firstLine="720"/>
+        <w:rPr>
+          <w:rFonts w:asciiTheme="minorBidi" w:hAnsiTheme="minorBidi"/>
+          <w:sz w:val="20"/>
+          <w:szCs w:val="20"/>
+        </w:rPr>
+      </w:pPr>
+      <w:r>
+        <w:rPr>
+          <w:rFonts w:asciiTheme="minorBidi" w:hAnsiTheme="minorBidi"/>
+          <w:sz w:val="20"/>
+          <w:szCs w:val="20"/>
+        </w:rPr>
+        <w:t xml:space="preserve">Transfer </w:t>
+      </w:r>
+      <w:r>
+        <w:rPr>
+          <w:rFonts w:asciiTheme="minorBidi" w:hAnsiTheme="minorBidi"/>
+          <w:sz w:val="20"/>
+          <w:szCs w:val="20"/>
+        </w:rPr>
+        <w:t>S</w:t>
+      </w:r>
+      <w:r>
+        <w:rPr>
+          <w:rFonts w:asciiTheme="minorBidi" w:hAnsiTheme="minorBidi"/>
+          <w:sz w:val="20"/>
+          <w:szCs w:val="20"/>
+        </w:rPr>
+        <w:t>tudent</w:t>
+      </w:r>
+    </w:p>
+    <w:p>
+      <w:pPr>
+        <w:spacing w:line="240" w:lineRule="auto"/>
+        <w:ind w:left="720" w:firstLine="720"/>
+        <w:rPr>
+          <w:rFonts w:asciiTheme="minorBidi" w:hAnsiTheme="minorBidi"/>
+          <w:sz w:val="20"/>
+          <w:szCs w:val="20"/>
+          <w:rtl/>
+          <w:lang w:bidi="fa-IR"/>
+        </w:rPr>
+      </w:pPr>
+      <w:r>
+        <w:rPr>
+          <w:rFonts w:asciiTheme="minorBidi" w:hAnsiTheme="minorBidi"/>
+          <w:sz w:val="20"/>
+          <w:szCs w:val="20"/>
+        </w:rPr>
+        <w:t xml:space="preserve">Total </w:t>
+      </w:r>
+      <w:r>
+        <w:rPr>
+          <w:rFonts w:asciiTheme="minorBidi" w:hAnsiTheme="minorBidi"/>
+          <w:sz w:val="20"/>
+          <w:szCs w:val="20"/>
+        </w:rPr>
+        <w:t>GPA:</w:t>
+      </w:r>
+      <w:r>
+        <w:rPr>
+          <w:rFonts w:asciiTheme="minorBidi" w:hAnsiTheme="minorBidi"/>
+          <w:sz w:val="20"/>
+          <w:szCs w:val="20"/>
+        </w:rPr>
+        <w:t xml:space="preserve"> 16.</w:t>
+      </w:r>
+      <w:r>
+        <w:rPr>
+          <w:rFonts w:asciiTheme="minorBidi" w:hAnsiTheme="minorBidi"/>
+          <w:sz w:val="20"/>
+          <w:szCs w:val="20"/>
+        </w:rPr>
+        <w:t>7</w:t>
+      </w:r>
+      <w:r>
+        <w:rPr>
+          <w:rFonts w:asciiTheme="minorBidi" w:hAnsiTheme="minorBidi"/>
+          <w:sz w:val="20"/>
+          <w:szCs w:val="20"/>
+        </w:rPr>
+        <w:t>4</w:t>
+      </w:r>
+      <w:r>
+        <w:rPr>
+          <w:rFonts w:asciiTheme="minorBidi" w:hAnsiTheme="minorBidi"/>
+          <w:sz w:val="20"/>
+          <w:szCs w:val="20"/>
+        </w:rPr>
+        <w:t>/20</w:t>
+      </w:r>
+      <w:r>
+        <w:rPr>
+          <w:rFonts w:asciiTheme="minorBidi" w:hAnsiTheme="minorBidi"/>
+          <w:sz w:val="20"/>
+          <w:szCs w:val="20"/>
+        </w:rPr>
+        <w:t>=</w:t>
+      </w:r>
+      <w:r>
+        <w:rPr>
+          <w:rFonts w:asciiTheme="minorBidi" w:hAnsiTheme="minorBidi"/>
+          <w:sz w:val="20"/>
+          <w:szCs w:val="20"/>
+        </w:rPr>
+        <w:t>3.</w:t>
+      </w:r>
+      <w:r>
+        <w:rPr>
+          <w:rFonts w:asciiTheme="minorBidi" w:hAnsiTheme="minorBidi"/>
+          <w:sz w:val="20"/>
+          <w:szCs w:val="20"/>
+        </w:rPr>
+        <w:t>47</w:t>
+      </w:r>
+      <w:r>
+        <w:rPr>
+          <w:rFonts w:asciiTheme="minorBidi" w:hAnsiTheme="minorBidi"/>
+          <w:sz w:val="20"/>
+          <w:szCs w:val="20"/>
+        </w:rPr>
+        <w:t>/4</w:t>
+      </w:r>
+    </w:p>
+    <w:p>
+      <w:pPr>
+        <w:spacing w:line="240" w:lineRule="auto"/>
+        <w:rPr>
+          <w:rFonts w:asciiTheme="minorBidi" w:hAnsiTheme="minorBidi"/>
+          <w:b/>
+          <w:bCs/>
+          <w:sz w:val="20"/>
+          <w:szCs w:val="20"/>
+        </w:rPr>
+      </w:pPr>
+      <w:r>
+        <w:rPr>
+          <w:rFonts w:asciiTheme="minorBidi" w:hAnsiTheme="minorBidi"/>
+          <w:sz w:val="20"/>
+          <w:szCs w:val="20"/>
+        </w:rPr>
+        <w:t>2017</w:t>
+      </w:r>
+      <w:r>
+        <w:rPr>
+          <w:rFonts w:asciiTheme="minorBidi" w:hAnsiTheme="minorBidi"/>
+          <w:sz w:val="20"/>
+          <w:szCs w:val="20"/>
+        </w:rPr>
+        <w:t xml:space="preserve"> </w:t>
+      </w:r>
+      <w:r>
+        <w:rPr>
+          <w:rFonts w:asciiTheme="minorBidi" w:hAnsiTheme="minorBidi"/>
+          <w:sz w:val="20"/>
+          <w:szCs w:val="20"/>
+        </w:rPr>
+        <w:t>-</w:t>
+      </w:r>
+      <w:r>
+        <w:rPr>
+          <w:rFonts w:asciiTheme="minorBidi" w:hAnsiTheme="minorBidi"/>
+          <w:sz w:val="20"/>
+          <w:szCs w:val="20"/>
+        </w:rPr>
+        <w:t xml:space="preserve"> </w:t>
+      </w:r>
+      <w:r>
+        <w:rPr>
+          <w:rFonts w:asciiTheme="minorBidi" w:hAnsiTheme="minorBidi"/>
+          <w:sz w:val="20"/>
+          <w:szCs w:val="20"/>
+        </w:rPr>
+        <w:t>2019</w:t>
+      </w:r>
+      <w:r>
+        <w:rPr>
+          <w:rFonts w:asciiTheme="minorBidi" w:hAnsiTheme="minorBidi"/>
+          <w:sz w:val="20"/>
+          <w:szCs w:val="20"/>
+        </w:rPr>
+        <w:tab/>
+      </w:r>
+      <w:r>
+        <w:rPr>
+          <w:rFonts w:asciiTheme="minorBidi" w:hAnsiTheme="minorBidi"/>
+          <w:b/>
+          <w:bCs/>
+          <w:sz w:val="20"/>
+          <w:szCs w:val="20"/>
+        </w:rPr>
+        <w:t>Bachelor of Computer Engineering</w:t>
+      </w:r>
+    </w:p>
+    <w:p>
+      <w:pPr>
+        <w:spacing w:line="240" w:lineRule="auto"/>
+        <w:ind w:left="720" w:firstLine="720"/>
+        <w:rPr>
+          <w:rFonts w:asciiTheme="minorBidi" w:hAnsiTheme="minorBidi"/>
+          <w:sz w:val="20"/>
+          <w:szCs w:val="20"/>
+        </w:rPr>
+      </w:pPr>
+      <w:r>
+        <w:rPr>
+          <w:rFonts w:asciiTheme="minorBidi" w:hAnsiTheme="minorBidi"/>
+          <w:sz w:val="20"/>
+          <w:szCs w:val="20"/>
+        </w:rPr>
+        <w:t>University</w:t>
+      </w:r>
+      <w:r>
+        <w:rPr>
+          <w:rFonts w:asciiTheme="minorBidi" w:hAnsiTheme="minorBidi"/>
+          <w:sz w:val="20"/>
+          <w:szCs w:val="20"/>
+        </w:rPr>
+        <w:t xml:space="preserve"> of Zanjan</w:t>
+      </w:r>
+      <w:r>
+        <w:rPr>
+          <w:rFonts w:asciiTheme="minorBidi" w:hAnsiTheme="minorBidi"/>
+          <w:sz w:val="20"/>
+          <w:szCs w:val="20"/>
+        </w:rPr>
+        <w:t>,</w:t>
+      </w:r>
+      <w:r>
+        <w:rPr>
+          <w:rFonts w:asciiTheme="minorBidi" w:hAnsiTheme="minorBidi"/>
+          <w:sz w:val="20"/>
+          <w:szCs w:val="20"/>
+        </w:rPr>
+        <w:t xml:space="preserve"> </w:t>
+      </w:r>
+      <w:r>
+        <w:rPr>
+          <w:rFonts w:asciiTheme="minorBidi" w:hAnsiTheme="minorBidi"/>
+          <w:sz w:val="20"/>
+          <w:szCs w:val="20"/>
+        </w:rPr>
+        <w:t>Zanjan,</w:t>
+      </w:r>
+      <w:r>
+        <w:rPr>
+          <w:rFonts w:asciiTheme="minorBidi" w:hAnsiTheme="minorBidi"/>
+          <w:sz w:val="20"/>
+          <w:szCs w:val="20"/>
+        </w:rPr>
+        <w:t xml:space="preserve"> </w:t>
+      </w:r>
+      <w:r>
+        <w:rPr>
+          <w:rFonts w:asciiTheme="minorBidi" w:hAnsiTheme="minorBidi"/>
+          <w:sz w:val="20"/>
+          <w:szCs w:val="20"/>
+        </w:rPr>
+        <w:t>Zanjan</w:t>
+      </w:r>
+      <w:r>
+        <w:rPr>
+          <w:rFonts w:asciiTheme="minorBidi" w:hAnsiTheme="minorBidi"/>
+          <w:sz w:val="20"/>
+          <w:szCs w:val="20"/>
+        </w:rPr>
+        <w:t>,</w:t>
+      </w:r>
+      <w:r>
+        <w:rPr>
+          <w:rFonts w:asciiTheme="minorBidi" w:hAnsiTheme="minorBidi"/>
+          <w:sz w:val="20"/>
+          <w:szCs w:val="20"/>
+        </w:rPr>
+        <w:t xml:space="preserve"> </w:t>
+      </w:r>
+      <w:r>
+        <w:rPr>
+          <w:rFonts w:asciiTheme="minorBidi" w:hAnsiTheme="minorBidi"/>
+          <w:sz w:val="20"/>
+          <w:szCs w:val="20"/>
+        </w:rPr>
+        <w:t>Iran</w:t>
+      </w:r>
+    </w:p>
+    <w:p>
+      <w:pPr>
+        <w:spacing w:line="240" w:lineRule="auto"/>
+        <w:rPr>
+          <w:rFonts w:asciiTheme="minorBidi" w:hAnsiTheme="minorBidi"/>
+          <w:sz w:val="2"/>
+          <w:szCs w:val="2"/>
+        </w:rPr>
+      </w:pPr>
+    </w:p>
+    <w:p>
+      <w:pPr>
+        <w:tabs>
+          <w:tab w:val="left" w:pos="1996"/>
+        </w:tabs>
+        <w:rPr>
+          <w:rFonts w:asciiTheme="minorBidi" w:hAnsiTheme="minorBidi"/>
+          <w:b/>
+          <w:bCs/>
+          <w:sz w:val="24"/>
+          <w:szCs w:val="24"/>
+          <w:lang w:bidi="fa-IR"/>
+        </w:rPr>
+      </w:pPr>
+      <w:r>
+        <w:rPr>
+          <w:rFonts w:asciiTheme="minorBidi" w:hAnsiTheme="minorBidi"/>
+          <w:b/>
+          <w:bCs/>
+          <w:sz w:val="24"/>
+          <w:szCs w:val="24"/>
+          <w:lang w:bidi="fa-IR"/>
+        </w:rPr>
+        <w:t>SKILLS</w:t>
+      </w:r>
+      <w:r>
+        <w:rPr>
+          <w:rFonts w:asciiTheme="minorBidi" w:hAnsiTheme="minorBidi"/>
+          <w:b/>
+          <w:bCs/>
+          <w:sz w:val="24"/>
+          <w:szCs w:val="24"/>
+          <w:lang w:bidi="fa-IR"/>
+        </w:rPr>
+        <w:t xml:space="preserve"> &amp; </w:t>
+      </w:r>
+      <w:r>
+        <w:rPr>
+          <w:rFonts w:asciiTheme="minorBidi" w:hAnsiTheme="minorBidi"/>
+          <w:b/>
+          <w:bCs/>
+          <w:sz w:val="24"/>
+          <w:szCs w:val="24"/>
+          <w:lang w:bidi="fa-IR"/>
+        </w:rPr>
+        <w:t>INTERESTS</w:t>
       </w:r>
     </w:p>
     <w:p>
@@ -2420,7 +3496,25 @@
           <w:szCs w:val="20"/>
           <w:lang w:bidi="fa-IR"/>
         </w:rPr>
-        <w:t xml:space="preserve"> Python, PHP, JavaScript</w:t>
+        <w:t xml:space="preserve"> PHP, JavaScript</w:t>
+      </w:r>
+      <w:r>
+        <w:rPr>
+          <w:rFonts w:asciiTheme="minorBidi" w:hAnsiTheme="minorBidi"/>
+          <w:sz w:val="20"/>
+          <w:szCs w:val="20"/>
+          <w:lang w:bidi="fa-IR"/>
+        </w:rPr>
+        <w:t xml:space="preserve">, </w:t>
+      </w:r>
+      <w:r>
+        <w:rPr>
+          <w:rFonts w:asciiTheme="minorBidi" w:hAnsiTheme="minorBidi"/>
+          <w:sz w:val="20"/>
+          <w:szCs w:val="20"/>
+          <w:lang w:bidi="fa-IR"/>
+        </w:rPr>
+        <w:t>Python</w:t>
       </w:r>
     </w:p>
     <w:p>
@@ -2449,7 +3543,52 @@
           <w:szCs w:val="20"/>
           <w:lang w:bidi="fa-IR"/>
         </w:rPr>
-        <w:t xml:space="preserve">Frameworks: </w:t>
+        <w:t>Frameworks:</w:t>
+      </w:r>
+      <w:r>
+        <w:rPr>
+          <w:rFonts w:asciiTheme="minorBidi" w:hAnsiTheme="minorBidi"/>
+          <w:sz w:val="20"/>
+          <w:szCs w:val="20"/>
+          <w:lang w:bidi="fa-IR"/>
+        </w:rPr>
+        <w:t xml:space="preserve"> </w:t>
+      </w:r>
+      <w:r>
+        <w:rPr>
+          <w:rFonts w:asciiTheme="minorBidi" w:hAnsiTheme="minorBidi"/>
+          <w:sz w:val="20"/>
+          <w:szCs w:val="20"/>
+          <w:lang w:bidi="fa-IR"/>
+        </w:rPr>
+        <w:t>Laravel,</w:t>
+      </w:r>
+      <w:r>
+        <w:rPr>
+          <w:rFonts w:asciiTheme="minorBidi" w:hAnsiTheme="minorBidi"/>
+          <w:sz w:val="20"/>
+          <w:szCs w:val="20"/>
+          <w:lang w:bidi="fa-IR"/>
+        </w:rPr>
+        <w:t xml:space="preserve"> Lumen,</w:t>
+      </w:r>
+      <w:r>
+        <w:rPr>
+          <w:rFonts w:asciiTheme="minorBidi" w:hAnsiTheme="minorBidi"/>
+          <w:sz w:val="20"/>
+          <w:szCs w:val="20"/>
+          <w:lang w:bidi="fa-IR"/>
+        </w:rPr>
+        <w:t xml:space="preserve"> Nuxt.js</w:t>
+      </w:r>
+      <w:r>
+        <w:rPr>
+          <w:rFonts w:asciiTheme="minorBidi" w:hAnsiTheme="minorBidi"/>
+          <w:sz w:val="20"/>
+          <w:szCs w:val="20"/>
+          <w:lang w:bidi="fa-IR"/>
+        </w:rPr>
+        <w:t xml:space="preserve">, </w:t>
       </w:r>
       <w:r>
         <w:rPr>
@@ -2478,27 +3617,7 @@
           <w:szCs w:val="20"/>
           <w:lang w:bidi="fa-IR"/>
         </w:rPr>
-        <w:t>Scikit-learn,</w:t>
-      </w:r>
-      <w:r>
-        <w:rPr>
-          <w:rFonts w:asciiTheme="minorBidi" w:hAnsiTheme="minorBidi"/>
-          <w:b/>
-          <w:bCs/>
-          <w:sz w:val="20"/>
-          <w:szCs w:val="20"/>
-          <w:lang w:bidi="fa-IR"/>
-        </w:rPr>
-        <w:t xml:space="preserve"> </w:t>
-      </w:r>
-      <w:r>
-        <w:rPr>
-          <w:rFonts w:asciiTheme="minorBidi" w:hAnsiTheme="minorBidi"/>
-          <w:sz w:val="20"/>
-          <w:szCs w:val="20"/>
-          <w:lang w:bidi="fa-IR"/>
-        </w:rPr>
-        <w:t>Laravel, Nuxt.js</w:t>
+        <w:t>Scikit-learn</w:t>
       </w:r>
     </w:p>
     <w:p>
@@ -2541,1310 +3660,14 @@
     </w:p>
     <w:p>
       <w:pPr>
-        <w:spacing w:line="276" w:lineRule="auto"/>
-        <w:rPr>
-          <w:rFonts w:asciiTheme="minorBidi" w:hAnsiTheme="minorBidi"/>
-          <w:b/>
-          <w:bCs/>
-          <w:sz w:val="24"/>
-          <w:szCs w:val="24"/>
-        </w:rPr>
-      </w:pPr>
-      <w:r>
-        <w:rPr>
-          <w:rFonts w:asciiTheme="minorBidi" w:hAnsiTheme="minorBidi"/>
-          <w:b/>
-          <w:bCs/>
-          <w:sz w:val="24"/>
-          <w:szCs w:val="24"/>
-        </w:rPr>
-        <w:t>EDUCATION</w:t>
-      </w:r>
-    </w:p>
-    <w:p>
-      <w:pPr>
-        <w:spacing w:line="240" w:lineRule="auto"/>
-        <w:rPr>
-          <w:rFonts w:asciiTheme="minorBidi" w:hAnsiTheme="minorBidi"/>
-          <w:b/>
-          <w:bCs/>
-          <w:sz w:val="20"/>
-          <w:szCs w:val="20"/>
-        </w:rPr>
-      </w:pPr>
-      <w:bookmarkStart w:id="0" w:name="_Hlk92315511"/>
-      <w:r>
-        <w:rPr>
-          <w:rFonts w:asciiTheme="minorBidi" w:hAnsiTheme="minorBidi"/>
-          <w:sz w:val="20"/>
-          <w:szCs w:val="20"/>
-        </w:rPr>
-        <w:t>20</w:t>
-      </w:r>
-      <w:r>
-        <w:rPr>
-          <w:rFonts w:asciiTheme="minorBidi" w:hAnsiTheme="minorBidi"/>
-          <w:sz w:val="20"/>
-          <w:szCs w:val="20"/>
-        </w:rPr>
-        <w:t>23</w:t>
-      </w:r>
-      <w:r>
-        <w:rPr>
-          <w:rFonts w:asciiTheme="minorBidi" w:hAnsiTheme="minorBidi"/>
-          <w:sz w:val="20"/>
-          <w:szCs w:val="20"/>
-        </w:rPr>
-        <w:t xml:space="preserve"> - </w:t>
-      </w:r>
-      <w:r>
-        <w:rPr>
-          <w:rFonts w:asciiTheme="minorBidi" w:hAnsiTheme="minorBidi"/>
-          <w:sz w:val="20"/>
-          <w:szCs w:val="20"/>
-        </w:rPr>
-        <w:t>Current</w:t>
-      </w:r>
-      <w:r>
-        <w:rPr>
-          <w:rFonts w:asciiTheme="minorBidi" w:hAnsiTheme="minorBidi"/>
-          <w:sz w:val="20"/>
-          <w:szCs w:val="20"/>
-        </w:rPr>
-        <w:tab/>
-      </w:r>
-      <w:r>
-        <w:rPr>
-          <w:rFonts w:asciiTheme="minorBidi" w:hAnsiTheme="minorBidi"/>
-          <w:b/>
-          <w:bCs/>
-          <w:sz w:val="20"/>
-          <w:szCs w:val="20"/>
-        </w:rPr>
-        <w:t>Master of Computer Science</w:t>
-      </w:r>
-      <w:r>
-        <w:rPr>
-          <w:rFonts w:asciiTheme="minorBidi" w:hAnsiTheme="minorBidi"/>
-          <w:b/>
-          <w:bCs/>
-          <w:sz w:val="20"/>
-          <w:szCs w:val="20"/>
-        </w:rPr>
-        <w:t xml:space="preserve"> </w:t>
-      </w:r>
-    </w:p>
-    <w:p>
-      <w:pPr>
-        <w:spacing w:line="240" w:lineRule="auto"/>
-        <w:ind w:left="720" w:firstLine="720"/>
-        <w:rPr>
-          <w:rFonts w:asciiTheme="minorBidi" w:hAnsiTheme="minorBidi"/>
-          <w:sz w:val="20"/>
-          <w:szCs w:val="20"/>
-        </w:rPr>
-      </w:pPr>
-      <w:r>
-        <w:rPr>
-          <w:rFonts w:asciiTheme="minorBidi" w:hAnsiTheme="minorBidi"/>
-          <w:sz w:val="20"/>
-          <w:szCs w:val="20"/>
-        </w:rPr>
-        <w:t>Concordia University</w:t>
-      </w:r>
-      <w:r>
-        <w:rPr>
-          <w:rFonts w:asciiTheme="minorBidi" w:hAnsiTheme="minorBidi"/>
-          <w:sz w:val="20"/>
-          <w:szCs w:val="20"/>
-        </w:rPr>
-        <w:t xml:space="preserve">, </w:t>
-      </w:r>
-      <w:r>
-        <w:rPr>
-          <w:rFonts w:asciiTheme="minorBidi" w:hAnsiTheme="minorBidi"/>
-          <w:sz w:val="20"/>
-          <w:szCs w:val="20"/>
-        </w:rPr>
-        <w:t>Montréal</w:t>
-      </w:r>
-      <w:r>
-        <w:rPr>
-          <w:rFonts w:asciiTheme="minorBidi" w:hAnsiTheme="minorBidi"/>
-          <w:sz w:val="20"/>
-          <w:szCs w:val="20"/>
-        </w:rPr>
-        <w:t xml:space="preserve">, </w:t>
-      </w:r>
-      <w:r>
-        <w:rPr>
-          <w:rFonts w:asciiTheme="minorBidi" w:hAnsiTheme="minorBidi"/>
-          <w:sz w:val="20"/>
-          <w:szCs w:val="20"/>
-        </w:rPr>
-        <w:t>Québec</w:t>
-      </w:r>
-      <w:r>
-        <w:rPr>
-          <w:rFonts w:asciiTheme="minorBidi" w:hAnsiTheme="minorBidi"/>
-          <w:sz w:val="20"/>
-          <w:szCs w:val="20"/>
-        </w:rPr>
-        <w:t>,</w:t>
-      </w:r>
-      <w:r>
-        <w:rPr>
-          <w:rFonts w:asciiTheme="minorBidi" w:hAnsiTheme="minorBidi"/>
-          <w:sz w:val="20"/>
-          <w:szCs w:val="20"/>
-        </w:rPr>
-        <w:t xml:space="preserve"> </w:t>
-      </w:r>
-      <w:r>
-        <w:rPr>
-          <w:rFonts w:asciiTheme="minorBidi" w:hAnsiTheme="minorBidi"/>
-          <w:sz w:val="20"/>
-          <w:szCs w:val="20"/>
-        </w:rPr>
-        <w:t>Canada</w:t>
-      </w:r>
-    </w:p>
-    <w:p>
-      <w:pPr>
-        <w:spacing w:line="276" w:lineRule="auto"/>
-        <w:rPr>
-          <w:rFonts w:asciiTheme="minorBidi" w:hAnsiTheme="minorBidi"/>
-          <w:b/>
-          <w:bCs/>
-          <w:sz w:val="20"/>
-          <w:szCs w:val="20"/>
-        </w:rPr>
-      </w:pPr>
-      <w:r>
-        <w:rPr>
-          <w:rFonts w:asciiTheme="minorBidi" w:hAnsiTheme="minorBidi"/>
-          <w:sz w:val="20"/>
-          <w:szCs w:val="20"/>
-        </w:rPr>
-        <w:t>2020</w:t>
-      </w:r>
-      <w:r>
-        <w:rPr>
-          <w:rFonts w:asciiTheme="minorBidi" w:hAnsiTheme="minorBidi"/>
-          <w:sz w:val="20"/>
-          <w:szCs w:val="20"/>
-        </w:rPr>
-        <w:t xml:space="preserve"> </w:t>
-      </w:r>
-      <w:r>
-        <w:rPr>
-          <w:rFonts w:asciiTheme="minorBidi" w:hAnsiTheme="minorBidi"/>
-          <w:sz w:val="20"/>
-          <w:szCs w:val="20"/>
-        </w:rPr>
-        <w:t>-</w:t>
-      </w:r>
-      <w:r>
-        <w:rPr>
-          <w:rFonts w:asciiTheme="minorBidi" w:hAnsiTheme="minorBidi"/>
-          <w:sz w:val="20"/>
-          <w:szCs w:val="20"/>
-        </w:rPr>
-        <w:t xml:space="preserve"> </w:t>
-      </w:r>
-      <w:r>
-        <w:rPr>
-          <w:rFonts w:asciiTheme="minorBidi" w:hAnsiTheme="minorBidi"/>
-          <w:sz w:val="20"/>
-          <w:szCs w:val="20"/>
-        </w:rPr>
-        <w:t>2022</w:t>
-      </w:r>
-      <w:r>
-        <w:rPr>
-          <w:rFonts w:asciiTheme="minorBidi" w:hAnsiTheme="minorBidi"/>
-          <w:b/>
-          <w:bCs/>
-          <w:sz w:val="20"/>
-          <w:szCs w:val="20"/>
-        </w:rPr>
-        <w:t xml:space="preserve"> </w:t>
-      </w:r>
-      <w:r>
-        <w:rPr>
-          <w:rFonts w:asciiTheme="minorBidi" w:hAnsiTheme="minorBidi"/>
-          <w:b/>
-          <w:bCs/>
-          <w:sz w:val="20"/>
-          <w:szCs w:val="20"/>
-        </w:rPr>
-        <w:tab/>
-      </w:r>
-      <w:r>
-        <w:rPr>
-          <w:rFonts w:asciiTheme="minorBidi" w:hAnsiTheme="minorBidi"/>
-          <w:b/>
-          <w:bCs/>
-          <w:sz w:val="20"/>
-          <w:szCs w:val="20"/>
-        </w:rPr>
-        <w:t>Bachelor of Computer Engineering</w:t>
-      </w:r>
-    </w:p>
-    <w:bookmarkEnd w:id="0"/>
-    <w:p>
-      <w:pPr>
-        <w:spacing w:line="240" w:lineRule="auto"/>
-        <w:ind w:left="1440"/>
-        <w:rPr>
-          <w:rFonts w:asciiTheme="minorBidi" w:hAnsiTheme="minorBidi"/>
-          <w:sz w:val="20"/>
-          <w:szCs w:val="20"/>
-        </w:rPr>
-      </w:pPr>
-      <w:r>
-        <w:rPr>
-          <w:rFonts w:asciiTheme="minorBidi" w:hAnsiTheme="minorBidi"/>
-          <w:sz w:val="20"/>
-          <w:szCs w:val="20"/>
-        </w:rPr>
-        <w:t xml:space="preserve">Islamic </w:t>
-      </w:r>
-      <w:r>
-        <w:rPr>
-          <w:rFonts w:asciiTheme="minorBidi" w:hAnsiTheme="minorBidi"/>
-          <w:sz w:val="20"/>
-          <w:szCs w:val="20"/>
-        </w:rPr>
-        <w:t>Azad University</w:t>
-      </w:r>
-      <w:r>
-        <w:rPr>
-          <w:rFonts w:asciiTheme="minorBidi" w:hAnsiTheme="minorBidi"/>
-          <w:sz w:val="20"/>
-          <w:szCs w:val="20"/>
-        </w:rPr>
-        <w:t>, Zanjan,</w:t>
-      </w:r>
-      <w:r>
-        <w:rPr>
-          <w:rFonts w:asciiTheme="minorBidi" w:hAnsiTheme="minorBidi"/>
-          <w:sz w:val="20"/>
-          <w:szCs w:val="20"/>
-        </w:rPr>
-        <w:t xml:space="preserve"> </w:t>
-      </w:r>
-      <w:r>
-        <w:rPr>
-          <w:rFonts w:asciiTheme="minorBidi" w:hAnsiTheme="minorBidi"/>
-          <w:sz w:val="20"/>
-          <w:szCs w:val="20"/>
-        </w:rPr>
-        <w:t>Zanjan</w:t>
-      </w:r>
-      <w:r>
-        <w:rPr>
-          <w:rFonts w:asciiTheme="minorBidi" w:hAnsiTheme="minorBidi"/>
-          <w:sz w:val="20"/>
-          <w:szCs w:val="20"/>
-        </w:rPr>
-        <w:t>,</w:t>
-      </w:r>
-      <w:r>
-        <w:rPr>
-          <w:rFonts w:asciiTheme="minorBidi" w:hAnsiTheme="minorBidi"/>
-          <w:sz w:val="20"/>
-          <w:szCs w:val="20"/>
-        </w:rPr>
-        <w:t xml:space="preserve"> Iran</w:t>
-      </w:r>
-    </w:p>
-    <w:p>
-      <w:pPr>
-        <w:spacing w:line="240" w:lineRule="auto"/>
-        <w:ind w:left="720" w:firstLine="720"/>
-        <w:rPr>
-          <w:rFonts w:asciiTheme="minorBidi" w:hAnsiTheme="minorBidi"/>
-          <w:sz w:val="20"/>
-          <w:szCs w:val="20"/>
-        </w:rPr>
-      </w:pPr>
-      <w:r>
-        <w:rPr>
-          <w:rFonts w:asciiTheme="minorBidi" w:hAnsiTheme="minorBidi"/>
-          <w:sz w:val="20"/>
-          <w:szCs w:val="20"/>
-        </w:rPr>
-        <w:t xml:space="preserve">Transfer </w:t>
-      </w:r>
-      <w:r>
-        <w:rPr>
-          <w:rFonts w:asciiTheme="minorBidi" w:hAnsiTheme="minorBidi"/>
-          <w:sz w:val="20"/>
-          <w:szCs w:val="20"/>
-        </w:rPr>
-        <w:t>S</w:t>
-      </w:r>
-      <w:r>
-        <w:rPr>
-          <w:rFonts w:asciiTheme="minorBidi" w:hAnsiTheme="minorBidi"/>
-          <w:sz w:val="20"/>
-          <w:szCs w:val="20"/>
-        </w:rPr>
-        <w:t>tudent</w:t>
-      </w:r>
-    </w:p>
-    <w:p>
-      <w:pPr>
-        <w:spacing w:line="240" w:lineRule="auto"/>
-        <w:ind w:left="720" w:firstLine="720"/>
-        <w:rPr>
-          <w:rFonts w:asciiTheme="minorBidi" w:hAnsiTheme="minorBidi"/>
-          <w:sz w:val="20"/>
-          <w:szCs w:val="20"/>
-          <w:rtl/>
-          <w:lang w:bidi="fa-IR"/>
-        </w:rPr>
-      </w:pPr>
-      <w:r>
-        <w:rPr>
-          <w:rFonts w:asciiTheme="minorBidi" w:hAnsiTheme="minorBidi"/>
-          <w:sz w:val="20"/>
-          <w:szCs w:val="20"/>
-        </w:rPr>
-        <w:t xml:space="preserve">Total </w:t>
-      </w:r>
-      <w:r>
-        <w:rPr>
-          <w:rFonts w:asciiTheme="minorBidi" w:hAnsiTheme="minorBidi"/>
-          <w:sz w:val="20"/>
-          <w:szCs w:val="20"/>
-        </w:rPr>
-        <w:t>GPA:</w:t>
-      </w:r>
-      <w:r>
-        <w:rPr>
-          <w:rFonts w:asciiTheme="minorBidi" w:hAnsiTheme="minorBidi"/>
-          <w:sz w:val="20"/>
-          <w:szCs w:val="20"/>
-        </w:rPr>
-        <w:t xml:space="preserve"> 16.</w:t>
-      </w:r>
-      <w:r>
-        <w:rPr>
-          <w:rFonts w:asciiTheme="minorBidi" w:hAnsiTheme="minorBidi"/>
-          <w:sz w:val="20"/>
-          <w:szCs w:val="20"/>
-        </w:rPr>
-        <w:t>7</w:t>
-      </w:r>
-      <w:r>
-        <w:rPr>
-          <w:rFonts w:asciiTheme="minorBidi" w:hAnsiTheme="minorBidi"/>
-          <w:sz w:val="20"/>
-          <w:szCs w:val="20"/>
-        </w:rPr>
-        <w:t>4</w:t>
-      </w:r>
-      <w:r>
-        <w:rPr>
-          <w:rFonts w:asciiTheme="minorBidi" w:hAnsiTheme="minorBidi"/>
-          <w:sz w:val="20"/>
-          <w:szCs w:val="20"/>
-        </w:rPr>
-        <w:t>/20</w:t>
-      </w:r>
-      <w:r>
-        <w:rPr>
-          <w:rFonts w:asciiTheme="minorBidi" w:hAnsiTheme="minorBidi"/>
-          <w:sz w:val="20"/>
-          <w:szCs w:val="20"/>
-        </w:rPr>
-        <w:t>=</w:t>
-      </w:r>
-      <w:r>
-        <w:rPr>
-          <w:rFonts w:asciiTheme="minorBidi" w:hAnsiTheme="minorBidi"/>
-          <w:sz w:val="20"/>
-          <w:szCs w:val="20"/>
-        </w:rPr>
-        <w:t>3.</w:t>
-      </w:r>
-      <w:r>
-        <w:rPr>
-          <w:rFonts w:asciiTheme="minorBidi" w:hAnsiTheme="minorBidi"/>
-          <w:sz w:val="20"/>
-          <w:szCs w:val="20"/>
-        </w:rPr>
-        <w:t>47</w:t>
-      </w:r>
-      <w:r>
-        <w:rPr>
-          <w:rFonts w:asciiTheme="minorBidi" w:hAnsiTheme="minorBidi"/>
-          <w:sz w:val="20"/>
-          <w:szCs w:val="20"/>
-        </w:rPr>
-        <w:t>/4</w:t>
-      </w:r>
-    </w:p>
-    <w:p>
-      <w:pPr>
-        <w:spacing w:line="240" w:lineRule="auto"/>
-        <w:rPr>
-          <w:rFonts w:asciiTheme="minorBidi" w:hAnsiTheme="minorBidi"/>
-          <w:b/>
-          <w:bCs/>
-          <w:sz w:val="20"/>
-          <w:szCs w:val="20"/>
-        </w:rPr>
-      </w:pPr>
-      <w:r>
-        <w:rPr>
-          <w:rFonts w:asciiTheme="minorBidi" w:hAnsiTheme="minorBidi"/>
-          <w:sz w:val="20"/>
-          <w:szCs w:val="20"/>
-        </w:rPr>
-        <w:t>2017</w:t>
-      </w:r>
-      <w:r>
-        <w:rPr>
-          <w:rFonts w:asciiTheme="minorBidi" w:hAnsiTheme="minorBidi"/>
-          <w:sz w:val="20"/>
-          <w:szCs w:val="20"/>
-        </w:rPr>
-        <w:t xml:space="preserve"> </w:t>
-      </w:r>
-      <w:r>
-        <w:rPr>
-          <w:rFonts w:asciiTheme="minorBidi" w:hAnsiTheme="minorBidi"/>
-          <w:sz w:val="20"/>
-          <w:szCs w:val="20"/>
-        </w:rPr>
-        <w:t>-</w:t>
-      </w:r>
-      <w:r>
-        <w:rPr>
-          <w:rFonts w:asciiTheme="minorBidi" w:hAnsiTheme="minorBidi"/>
-          <w:sz w:val="20"/>
-          <w:szCs w:val="20"/>
-        </w:rPr>
-        <w:t xml:space="preserve"> </w:t>
-      </w:r>
-      <w:r>
-        <w:rPr>
-          <w:rFonts w:asciiTheme="minorBidi" w:hAnsiTheme="minorBidi"/>
-          <w:sz w:val="20"/>
-          <w:szCs w:val="20"/>
-        </w:rPr>
-        <w:t>2019</w:t>
-      </w:r>
-      <w:r>
-        <w:rPr>
-          <w:rFonts w:asciiTheme="minorBidi" w:hAnsiTheme="minorBidi"/>
-          <w:sz w:val="20"/>
-          <w:szCs w:val="20"/>
-        </w:rPr>
-        <w:tab/>
-      </w:r>
-      <w:r>
-        <w:rPr>
-          <w:rFonts w:asciiTheme="minorBidi" w:hAnsiTheme="minorBidi"/>
-          <w:b/>
-          <w:bCs/>
-          <w:sz w:val="20"/>
-          <w:szCs w:val="20"/>
-        </w:rPr>
-        <w:t>Bachelor of Computer Engineering</w:t>
-      </w:r>
-    </w:p>
-    <w:p>
-      <w:pPr>
-        <w:spacing w:line="240" w:lineRule="auto"/>
-        <w:ind w:left="720" w:firstLine="720"/>
-        <w:rPr>
-          <w:rFonts w:asciiTheme="minorBidi" w:hAnsiTheme="minorBidi"/>
-          <w:sz w:val="20"/>
-          <w:szCs w:val="20"/>
-        </w:rPr>
-      </w:pPr>
-      <w:r>
-        <w:rPr>
-          <w:rFonts w:asciiTheme="minorBidi" w:hAnsiTheme="minorBidi"/>
-          <w:sz w:val="20"/>
-          <w:szCs w:val="20"/>
-        </w:rPr>
-        <w:t>University</w:t>
-      </w:r>
-      <w:r>
-        <w:rPr>
-          <w:rFonts w:asciiTheme="minorBidi" w:hAnsiTheme="minorBidi"/>
-          <w:sz w:val="20"/>
-          <w:szCs w:val="20"/>
-        </w:rPr>
-        <w:t xml:space="preserve"> of Zanjan</w:t>
-      </w:r>
-      <w:r>
-        <w:rPr>
-          <w:rFonts w:asciiTheme="minorBidi" w:hAnsiTheme="minorBidi"/>
-          <w:sz w:val="20"/>
-          <w:szCs w:val="20"/>
-        </w:rPr>
-        <w:t>,</w:t>
-      </w:r>
-      <w:r>
-        <w:rPr>
-          <w:rFonts w:asciiTheme="minorBidi" w:hAnsiTheme="minorBidi"/>
-          <w:sz w:val="20"/>
-          <w:szCs w:val="20"/>
-        </w:rPr>
-        <w:t xml:space="preserve"> </w:t>
-      </w:r>
-      <w:r>
-        <w:rPr>
-          <w:rFonts w:asciiTheme="minorBidi" w:hAnsiTheme="minorBidi"/>
-          <w:sz w:val="20"/>
-          <w:szCs w:val="20"/>
-        </w:rPr>
-        <w:t>Zanjan,</w:t>
-      </w:r>
-      <w:r>
-        <w:rPr>
-          <w:rFonts w:asciiTheme="minorBidi" w:hAnsiTheme="minorBidi"/>
-          <w:sz w:val="20"/>
-          <w:szCs w:val="20"/>
-        </w:rPr>
-        <w:t xml:space="preserve"> </w:t>
-      </w:r>
-      <w:r>
-        <w:rPr>
-          <w:rFonts w:asciiTheme="minorBidi" w:hAnsiTheme="minorBidi"/>
-          <w:sz w:val="20"/>
-          <w:szCs w:val="20"/>
-        </w:rPr>
-        <w:t>Zanjan</w:t>
-      </w:r>
-      <w:r>
-        <w:rPr>
-          <w:rFonts w:asciiTheme="minorBidi" w:hAnsiTheme="minorBidi"/>
-          <w:sz w:val="20"/>
-          <w:szCs w:val="20"/>
-        </w:rPr>
-        <w:t>,</w:t>
-      </w:r>
-      <w:r>
-        <w:rPr>
-          <w:rFonts w:asciiTheme="minorBidi" w:hAnsiTheme="minorBidi"/>
-          <w:sz w:val="20"/>
-          <w:szCs w:val="20"/>
-        </w:rPr>
-        <w:t xml:space="preserve"> </w:t>
-      </w:r>
-      <w:r>
-        <w:rPr>
-          <w:rFonts w:asciiTheme="minorBidi" w:hAnsiTheme="minorBidi"/>
-          <w:sz w:val="20"/>
-          <w:szCs w:val="20"/>
-        </w:rPr>
-        <w:t>Iran</w:t>
-      </w:r>
-    </w:p>
-    <w:p>
-      <w:pPr>
-        <w:tabs>
-          <w:tab w:val="left" w:pos="5280"/>
-        </w:tabs>
-        <w:spacing w:line="276" w:lineRule="auto"/>
-        <w:rPr>
-          <w:rFonts w:asciiTheme="minorBidi" w:hAnsiTheme="minorBidi"/>
-          <w:sz w:val="2"/>
-          <w:szCs w:val="2"/>
-        </w:rPr>
-      </w:pPr>
-    </w:p>
-    <w:p>
-      <w:pPr>
-        <w:tabs>
-          <w:tab w:val="left" w:pos="5280"/>
-        </w:tabs>
-        <w:spacing w:line="276" w:lineRule="auto"/>
-        <w:rPr>
-          <w:rFonts w:asciiTheme="minorBidi" w:hAnsiTheme="minorBidi"/>
-          <w:sz w:val="20"/>
-          <w:szCs w:val="20"/>
-          <w:lang w:bidi="fa-IR"/>
-        </w:rPr>
-      </w:pPr>
-      <w:r>
-        <w:rPr>
-          <w:rFonts w:asciiTheme="minorBidi" w:hAnsiTheme="minorBidi"/>
-          <w:b/>
-          <w:bCs/>
-          <w:sz w:val="24"/>
-          <w:szCs w:val="24"/>
-          <w:lang w:bidi="fa-IR"/>
-        </w:rPr>
-        <w:t>ONLINE</w:t>
-      </w:r>
-      <w:r>
-        <w:rPr>
-          <w:rFonts w:asciiTheme="minorBidi" w:hAnsiTheme="minorBidi"/>
-          <w:b/>
-          <w:bCs/>
-          <w:sz w:val="24"/>
-          <w:szCs w:val="24"/>
-          <w:lang w:bidi="fa-IR"/>
-        </w:rPr>
-        <w:t xml:space="preserve"> COURSES</w:t>
-      </w:r>
-    </w:p>
-    <w:p>
-      <w:pPr>
-        <w:spacing w:line="240" w:lineRule="auto"/>
-        <w:rPr>
-          <w:rStyle w:val="Hyperlink"/>
-          <w:rFonts w:asciiTheme="minorBidi" w:hAnsiTheme="minorBidi"/>
-          <w:color w:val="1F3864" w:themeColor="accent1" w:themeShade="80"/>
-          <w:sz w:val="20"/>
-          <w:szCs w:val="20"/>
-          <w:u w:val="none"/>
-        </w:rPr>
-      </w:pPr>
-      <w:r>
-        <w:rPr>
-          <w:rFonts w:asciiTheme="minorBidi" w:hAnsiTheme="minorBidi"/>
-          <w:sz w:val="20"/>
-          <w:szCs w:val="20"/>
-        </w:rPr>
-        <w:t>Jun</w:t>
-      </w:r>
-      <w:r>
-        <w:rPr>
-          <w:rFonts w:asciiTheme="minorBidi" w:hAnsiTheme="minorBidi"/>
-          <w:sz w:val="20"/>
-          <w:szCs w:val="20"/>
-        </w:rPr>
-        <w:t>e</w:t>
-      </w:r>
-      <w:r>
-        <w:rPr>
-          <w:rFonts w:asciiTheme="minorBidi" w:hAnsiTheme="minorBidi"/>
-          <w:sz w:val="20"/>
-          <w:szCs w:val="20"/>
-        </w:rPr>
-        <w:t xml:space="preserve"> 202</w:t>
-      </w:r>
-      <w:r>
-        <w:rPr>
-          <w:rFonts w:asciiTheme="minorBidi" w:hAnsiTheme="minorBidi"/>
-          <w:sz w:val="20"/>
-          <w:szCs w:val="20"/>
-        </w:rPr>
-        <w:t>3</w:t>
-      </w:r>
-      <w:r>
-        <w:rPr>
-          <w:rFonts w:asciiTheme="minorBidi" w:hAnsiTheme="minorBidi"/>
-          <w:sz w:val="20"/>
-          <w:szCs w:val="20"/>
-        </w:rPr>
-        <w:tab/>
-      </w:r>
-      <w:hyperlink r:id="rId18" w:history="1">
-        <w:r>
-          <w:rPr>
-            <w:rStyle w:val="Hyperlink"/>
-            <w:rFonts w:asciiTheme="minorBidi" w:hAnsiTheme="minorBidi"/>
-            <w:color w:val="1F3864" w:themeColor="accent1" w:themeShade="80"/>
-            <w:sz w:val="20"/>
-            <w:szCs w:val="20"/>
-            <w:u w:val="none"/>
-          </w:rPr>
-          <w:t>Mathematics for Machine Learning and Data Science</w:t>
-        </w:r>
-      </w:hyperlink>
-    </w:p>
-    <w:p>
-      <w:pPr>
-        <w:spacing w:line="240" w:lineRule="auto"/>
-        <w:ind w:left="720" w:firstLine="720"/>
-      </w:pPr>
-      <w:r>
-        <w:rPr>
-          <w:rFonts w:asciiTheme="minorBidi" w:hAnsiTheme="minorBidi"/>
-          <w:sz w:val="20"/>
-          <w:szCs w:val="20"/>
-        </w:rPr>
-        <w:t>Coursera, DeepLearning.AI</w:t>
-      </w:r>
-    </w:p>
-    <w:p>
-      <w:pPr>
-        <w:spacing w:line="240" w:lineRule="auto"/>
-        <w:rPr>
-          <w:rStyle w:val="Hyperlink"/>
-          <w:rFonts w:asciiTheme="minorBidi" w:hAnsiTheme="minorBidi"/>
-          <w:color w:val="1F3864" w:themeColor="accent1" w:themeShade="80"/>
-          <w:sz w:val="20"/>
-          <w:szCs w:val="20"/>
-          <w:u w:val="none"/>
-        </w:rPr>
-      </w:pPr>
-      <w:r>
-        <w:rPr>
-          <w:rFonts w:asciiTheme="minorBidi" w:hAnsiTheme="minorBidi"/>
-          <w:sz w:val="20"/>
-          <w:szCs w:val="20"/>
-        </w:rPr>
-        <w:t>May 2022</w:t>
-      </w:r>
-      <w:r>
-        <w:rPr>
-          <w:rFonts w:asciiTheme="minorBidi" w:hAnsiTheme="minorBidi"/>
-          <w:sz w:val="20"/>
-          <w:szCs w:val="20"/>
-        </w:rPr>
-        <w:tab/>
-      </w:r>
-      <w:hyperlink r:id="rId19" w:history="1">
-        <w:r>
-          <w:rPr>
-            <w:rStyle w:val="Hyperlink"/>
-            <w:rFonts w:asciiTheme="minorBidi" w:hAnsiTheme="minorBidi"/>
-            <w:color w:val="1F3864" w:themeColor="accent1" w:themeShade="80"/>
-            <w:sz w:val="20"/>
-            <w:szCs w:val="20"/>
-            <w:u w:val="none"/>
-          </w:rPr>
-          <w:t>Complete neural signal processing and analysis: Zero to hero</w:t>
-        </w:r>
-      </w:hyperlink>
-    </w:p>
-    <w:p>
-      <w:pPr>
-        <w:spacing w:line="240" w:lineRule="auto"/>
-        <w:ind w:left="720" w:firstLine="720"/>
-        <w:rPr>
-          <w:rFonts w:asciiTheme="minorBidi" w:hAnsiTheme="minorBidi"/>
-          <w:sz w:val="20"/>
-          <w:szCs w:val="20"/>
-        </w:rPr>
-      </w:pPr>
-      <w:r>
-        <w:rPr>
-          <w:rFonts w:asciiTheme="minorBidi" w:hAnsiTheme="minorBidi"/>
-          <w:sz w:val="20"/>
-          <w:szCs w:val="20"/>
-        </w:rPr>
-        <w:t>Udemy</w:t>
-      </w:r>
-    </w:p>
-    <w:p>
-      <w:pPr>
-        <w:spacing w:line="240" w:lineRule="auto"/>
-        <w:rPr>
-          <w:rFonts w:asciiTheme="minorBidi" w:hAnsiTheme="minorBidi"/>
-          <w:b/>
-          <w:bCs/>
-          <w:color w:val="1F3864" w:themeColor="accent1" w:themeShade="80"/>
-          <w:sz w:val="20"/>
-          <w:szCs w:val="20"/>
-        </w:rPr>
-      </w:pPr>
-      <w:r>
-        <w:rPr>
-          <w:rFonts w:asciiTheme="minorBidi" w:hAnsiTheme="minorBidi"/>
-          <w:sz w:val="20"/>
-          <w:szCs w:val="20"/>
-        </w:rPr>
-        <w:t>Apr 2022</w:t>
-      </w:r>
-      <w:r>
-        <w:rPr>
-          <w:rFonts w:asciiTheme="minorBidi" w:hAnsiTheme="minorBidi"/>
-          <w:sz w:val="20"/>
-          <w:szCs w:val="20"/>
-        </w:rPr>
-        <w:tab/>
-      </w:r>
-      <w:hyperlink r:id="rId20" w:history="1">
-        <w:r>
-          <w:rPr>
-            <w:rStyle w:val="Hyperlink"/>
-            <w:rFonts w:asciiTheme="minorBidi" w:hAnsiTheme="minorBidi"/>
-            <w:color w:val="1F3864" w:themeColor="accent1" w:themeShade="80"/>
-            <w:sz w:val="20"/>
-            <w:szCs w:val="20"/>
-            <w:u w:val="none"/>
-          </w:rPr>
-          <w:t>Machine Learning with Python</w:t>
-        </w:r>
-      </w:hyperlink>
-    </w:p>
-    <w:p>
-      <w:pPr>
-        <w:pStyle w:val="ListParagraph"/>
-        <w:tabs>
-          <w:tab w:val="left" w:pos="5280"/>
-        </w:tabs>
-        <w:spacing w:line="240" w:lineRule="auto"/>
-        <w:rPr>
-          <w:rFonts w:asciiTheme="minorBidi" w:hAnsiTheme="minorBidi"/>
-          <w:sz w:val="20"/>
-          <w:szCs w:val="20"/>
-          <w:lang w:bidi="fa-IR"/>
-        </w:rPr>
-      </w:pPr>
-      <w:r>
-        <w:rPr>
-          <w:rFonts w:asciiTheme="minorBidi" w:hAnsiTheme="minorBidi"/>
-          <w:color w:val="4C4D4F"/>
-          <w:sz w:val="20"/>
-          <w:szCs w:val="20"/>
-          <w:lang w:bidi="fa-IR"/>
-        </w:rPr>
-        <w:t xml:space="preserve">             </w:t>
-      </w:r>
-      <w:r>
-        <w:rPr>
-          <w:rFonts w:asciiTheme="minorBidi" w:hAnsiTheme="minorBidi"/>
-          <w:sz w:val="20"/>
-          <w:szCs w:val="20"/>
-          <w:lang w:bidi="fa-IR"/>
-        </w:rPr>
-        <w:t>Maktabkhoone, Grade: 95/100</w:t>
-      </w:r>
-    </w:p>
-    <w:p>
-      <w:pPr>
-        <w:spacing w:line="240" w:lineRule="auto"/>
-        <w:rPr>
-          <w:rFonts w:asciiTheme="minorBidi" w:hAnsiTheme="minorBidi"/>
-          <w:color w:val="1F3864" w:themeColor="accent1" w:themeShade="80"/>
-          <w:sz w:val="20"/>
-          <w:szCs w:val="20"/>
-        </w:rPr>
-      </w:pPr>
-      <w:r>
-        <w:rPr>
-          <w:rFonts w:asciiTheme="minorBidi" w:hAnsiTheme="minorBidi"/>
-          <w:sz w:val="20"/>
-          <w:szCs w:val="20"/>
-        </w:rPr>
-        <w:t>Mar</w:t>
-      </w:r>
-      <w:r>
-        <w:rPr>
-          <w:rFonts w:asciiTheme="minorBidi" w:hAnsiTheme="minorBidi"/>
-          <w:sz w:val="20"/>
-          <w:szCs w:val="20"/>
-        </w:rPr>
-        <w:t xml:space="preserve"> 202</w:t>
-      </w:r>
-      <w:r>
-        <w:rPr>
-          <w:rFonts w:asciiTheme="minorBidi" w:hAnsiTheme="minorBidi"/>
-          <w:sz w:val="20"/>
-          <w:szCs w:val="20"/>
-        </w:rPr>
-        <w:t>2</w:t>
-      </w:r>
-      <w:r>
-        <w:rPr>
-          <w:rFonts w:asciiTheme="minorBidi" w:hAnsiTheme="minorBidi"/>
-          <w:b/>
-          <w:bCs/>
-          <w:sz w:val="20"/>
-          <w:szCs w:val="20"/>
-        </w:rPr>
-        <w:t xml:space="preserve"> </w:t>
-      </w:r>
-      <w:r>
-        <w:rPr>
-          <w:rFonts w:asciiTheme="minorBidi" w:hAnsiTheme="minorBidi"/>
-          <w:b/>
-          <w:bCs/>
-          <w:sz w:val="20"/>
-          <w:szCs w:val="20"/>
-        </w:rPr>
-        <w:tab/>
-      </w:r>
-      <w:hyperlink r:id="rId21" w:history="1">
-        <w:r>
-          <w:rPr>
-            <w:rStyle w:val="Hyperlink"/>
-            <w:rFonts w:asciiTheme="minorBidi" w:hAnsiTheme="minorBidi"/>
-            <w:color w:val="1F3864" w:themeColor="accent1" w:themeShade="80"/>
-            <w:sz w:val="20"/>
-            <w:szCs w:val="20"/>
-            <w:u w:val="none"/>
-          </w:rPr>
-          <w:t>Object-Oriented Design</w:t>
-        </w:r>
-      </w:hyperlink>
-    </w:p>
-    <w:p>
-      <w:pPr>
-        <w:spacing w:line="240" w:lineRule="auto"/>
-        <w:ind w:left="720" w:firstLine="720"/>
-        <w:rPr>
-          <w:rFonts w:asciiTheme="minorBidi" w:hAnsiTheme="minorBidi"/>
-          <w:sz w:val="20"/>
-          <w:szCs w:val="20"/>
-          <w:lang w:bidi="fa-IR"/>
-        </w:rPr>
-      </w:pPr>
-      <w:r>
-        <w:rPr>
-          <w:rFonts w:asciiTheme="minorBidi" w:hAnsiTheme="minorBidi"/>
-          <w:sz w:val="20"/>
-          <w:szCs w:val="20"/>
-          <w:lang w:bidi="fa-IR"/>
-        </w:rPr>
-        <w:t xml:space="preserve">Coursera, </w:t>
-      </w:r>
-      <w:r>
-        <w:rPr>
-          <w:rFonts w:asciiTheme="minorBidi" w:hAnsiTheme="minorBidi"/>
-          <w:sz w:val="20"/>
-          <w:szCs w:val="20"/>
-          <w:lang w:bidi="fa-IR"/>
-        </w:rPr>
-        <w:t xml:space="preserve">University of </w:t>
-      </w:r>
-      <w:r>
-        <w:rPr>
-          <w:rFonts w:asciiTheme="minorBidi" w:hAnsiTheme="minorBidi"/>
-          <w:sz w:val="20"/>
-          <w:szCs w:val="20"/>
-          <w:lang w:bidi="fa-IR"/>
-        </w:rPr>
-        <w:t>Alberta</w:t>
-      </w:r>
-      <w:r>
-        <w:rPr>
-          <w:rFonts w:asciiTheme="minorBidi" w:hAnsiTheme="minorBidi"/>
-          <w:sz w:val="20"/>
-          <w:szCs w:val="20"/>
-          <w:lang w:bidi="fa-IR"/>
-        </w:rPr>
-        <w:t>, Grade: 9</w:t>
-      </w:r>
-      <w:r>
-        <w:rPr>
-          <w:rFonts w:asciiTheme="minorBidi" w:hAnsiTheme="minorBidi"/>
-          <w:sz w:val="20"/>
-          <w:szCs w:val="20"/>
-          <w:lang w:bidi="fa-IR"/>
-        </w:rPr>
-        <w:t>5</w:t>
-      </w:r>
-      <w:r>
-        <w:rPr>
-          <w:rFonts w:asciiTheme="minorBidi" w:hAnsiTheme="minorBidi"/>
-          <w:sz w:val="20"/>
-          <w:szCs w:val="20"/>
-          <w:lang w:bidi="fa-IR"/>
-        </w:rPr>
-        <w:t>.</w:t>
-      </w:r>
-      <w:r>
-        <w:rPr>
-          <w:rFonts w:asciiTheme="minorBidi" w:hAnsiTheme="minorBidi"/>
-          <w:sz w:val="20"/>
-          <w:szCs w:val="20"/>
-          <w:lang w:bidi="fa-IR"/>
-        </w:rPr>
-        <w:t>8/100</w:t>
-      </w:r>
-    </w:p>
-    <w:p>
-      <w:pPr>
-        <w:spacing w:line="240" w:lineRule="auto"/>
-        <w:rPr>
-          <w:rFonts w:asciiTheme="minorBidi" w:hAnsiTheme="minorBidi"/>
-          <w:color w:val="1F3864" w:themeColor="accent1" w:themeShade="80"/>
-          <w:sz w:val="20"/>
-          <w:szCs w:val="20"/>
-        </w:rPr>
-      </w:pPr>
-      <w:r>
-        <w:rPr>
-          <w:rFonts w:asciiTheme="minorBidi" w:hAnsiTheme="minorBidi"/>
-          <w:sz w:val="20"/>
-          <w:szCs w:val="20"/>
-        </w:rPr>
-        <w:t>Feb</w:t>
-      </w:r>
-      <w:r>
-        <w:rPr>
-          <w:rFonts w:asciiTheme="minorBidi" w:hAnsiTheme="minorBidi"/>
-          <w:sz w:val="20"/>
-          <w:szCs w:val="20"/>
-        </w:rPr>
-        <w:t xml:space="preserve"> 202</w:t>
-      </w:r>
-      <w:r>
-        <w:rPr>
-          <w:rFonts w:asciiTheme="minorBidi" w:hAnsiTheme="minorBidi"/>
-          <w:sz w:val="20"/>
-          <w:szCs w:val="20"/>
-        </w:rPr>
-        <w:t>2</w:t>
-      </w:r>
-      <w:r>
-        <w:rPr>
-          <w:rFonts w:asciiTheme="minorBidi" w:hAnsiTheme="minorBidi"/>
-          <w:b/>
-          <w:bCs/>
-          <w:sz w:val="20"/>
-          <w:szCs w:val="20"/>
-        </w:rPr>
-        <w:t xml:space="preserve"> </w:t>
-      </w:r>
-      <w:r>
-        <w:rPr>
-          <w:rFonts w:asciiTheme="minorBidi" w:hAnsiTheme="minorBidi"/>
-          <w:b/>
-          <w:bCs/>
-          <w:sz w:val="20"/>
-          <w:szCs w:val="20"/>
-        </w:rPr>
-        <w:tab/>
-      </w:r>
-      <w:hyperlink r:id="rId22" w:history="1">
-        <w:r>
-          <w:rPr>
-            <w:rStyle w:val="Hyperlink"/>
-            <w:rFonts w:asciiTheme="minorBidi" w:hAnsiTheme="minorBidi"/>
-            <w:color w:val="1F3864" w:themeColor="accent1" w:themeShade="80"/>
-            <w:sz w:val="20"/>
-            <w:szCs w:val="20"/>
-            <w:u w:val="none"/>
-          </w:rPr>
-          <w:t>Web Applications for Everybody</w:t>
-        </w:r>
-      </w:hyperlink>
-    </w:p>
-    <w:p>
-      <w:pPr>
-        <w:spacing w:line="240" w:lineRule="auto"/>
-        <w:ind w:left="720" w:firstLine="720"/>
-        <w:rPr>
-          <w:rFonts w:asciiTheme="minorBidi" w:hAnsiTheme="minorBidi"/>
-          <w:sz w:val="20"/>
-          <w:szCs w:val="20"/>
-        </w:rPr>
-      </w:pPr>
-      <w:r>
-        <w:rPr>
-          <w:rFonts w:asciiTheme="minorBidi" w:hAnsiTheme="minorBidi"/>
-          <w:sz w:val="20"/>
-          <w:szCs w:val="20"/>
-          <w:lang w:bidi="fa-IR"/>
-        </w:rPr>
-        <w:t xml:space="preserve">Coursera, </w:t>
-      </w:r>
-      <w:r>
-        <w:rPr>
-          <w:rFonts w:asciiTheme="minorBidi" w:hAnsiTheme="minorBidi"/>
-          <w:sz w:val="20"/>
-          <w:szCs w:val="20"/>
-          <w:lang w:bidi="fa-IR"/>
-        </w:rPr>
-        <w:t>University of Michigan</w:t>
-      </w:r>
-    </w:p>
-    <w:p>
-      <w:pPr>
-        <w:spacing w:line="240" w:lineRule="auto"/>
-        <w:rPr>
-          <w:rFonts w:asciiTheme="minorBidi" w:hAnsiTheme="minorBidi"/>
-          <w:color w:val="1F3864" w:themeColor="accent1" w:themeShade="80"/>
-          <w:sz w:val="20"/>
-          <w:szCs w:val="20"/>
-        </w:rPr>
-      </w:pPr>
-      <w:r>
-        <w:rPr>
-          <w:rFonts w:asciiTheme="minorBidi" w:hAnsiTheme="minorBidi"/>
-          <w:sz w:val="20"/>
-          <w:szCs w:val="20"/>
-        </w:rPr>
-        <w:t>Dec 2021</w:t>
-      </w:r>
-      <w:r>
-        <w:rPr>
-          <w:rFonts w:asciiTheme="minorBidi" w:hAnsiTheme="minorBidi"/>
-          <w:b/>
-          <w:bCs/>
-          <w:sz w:val="20"/>
-          <w:szCs w:val="20"/>
-        </w:rPr>
-        <w:t xml:space="preserve"> </w:t>
-      </w:r>
-      <w:r>
-        <w:rPr>
-          <w:rFonts w:asciiTheme="minorBidi" w:hAnsiTheme="minorBidi"/>
-          <w:b/>
-          <w:bCs/>
-          <w:sz w:val="20"/>
-          <w:szCs w:val="20"/>
-        </w:rPr>
-        <w:tab/>
-      </w:r>
-      <w:hyperlink r:id="rId23" w:history="1">
-        <w:r>
-          <w:rPr>
-            <w:rStyle w:val="Hyperlink"/>
-            <w:rFonts w:asciiTheme="minorBidi" w:hAnsiTheme="minorBidi"/>
-            <w:color w:val="1F3864" w:themeColor="accent1" w:themeShade="80"/>
-            <w:sz w:val="20"/>
-            <w:szCs w:val="20"/>
-            <w:u w:val="none"/>
-          </w:rPr>
-          <w:t>SQL for Data Science</w:t>
-        </w:r>
-      </w:hyperlink>
-    </w:p>
-    <w:p>
-      <w:pPr>
-        <w:tabs>
-          <w:tab w:val="left" w:pos="5280"/>
-        </w:tabs>
-        <w:spacing w:line="240" w:lineRule="auto"/>
-        <w:ind w:left="1440"/>
-        <w:rPr>
-          <w:rFonts w:asciiTheme="minorBidi" w:hAnsiTheme="minorBidi"/>
-          <w:sz w:val="20"/>
-          <w:szCs w:val="20"/>
-          <w:lang w:bidi="fa-IR"/>
-        </w:rPr>
-      </w:pPr>
-      <w:r>
-        <w:rPr>
-          <w:rFonts w:asciiTheme="minorBidi" w:hAnsiTheme="minorBidi"/>
-          <w:sz w:val="20"/>
-          <w:szCs w:val="20"/>
-          <w:lang w:bidi="fa-IR"/>
-        </w:rPr>
-        <w:t>Coursera,</w:t>
-      </w:r>
-      <w:r>
-        <w:rPr>
-          <w:rFonts w:asciiTheme="minorBidi" w:hAnsiTheme="minorBidi"/>
-          <w:sz w:val="20"/>
-          <w:szCs w:val="20"/>
-          <w:lang w:bidi="fa-IR"/>
-        </w:rPr>
-        <w:t xml:space="preserve"> University of </w:t>
-      </w:r>
-      <w:r>
-        <w:rPr>
-          <w:rFonts w:asciiTheme="minorBidi" w:hAnsiTheme="minorBidi"/>
-          <w:sz w:val="20"/>
-          <w:szCs w:val="20"/>
-          <w:lang w:bidi="fa-IR"/>
-        </w:rPr>
-        <w:t>California, Davis</w:t>
-      </w:r>
-      <w:r>
-        <w:rPr>
-          <w:rFonts w:asciiTheme="minorBidi" w:hAnsiTheme="minorBidi"/>
-          <w:sz w:val="20"/>
-          <w:szCs w:val="20"/>
-          <w:lang w:bidi="fa-IR"/>
-        </w:rPr>
-        <w:t>,</w:t>
-      </w:r>
-      <w:r>
-        <w:rPr>
-          <w:rFonts w:asciiTheme="minorBidi" w:hAnsiTheme="minorBidi"/>
-          <w:sz w:val="20"/>
-          <w:szCs w:val="20"/>
-          <w:lang w:bidi="fa-IR"/>
-        </w:rPr>
-        <w:t xml:space="preserve"> Grade: 91.1</w:t>
-      </w:r>
-      <w:r>
-        <w:rPr>
-          <w:rFonts w:asciiTheme="minorBidi" w:hAnsiTheme="minorBidi"/>
-          <w:sz w:val="20"/>
-          <w:szCs w:val="20"/>
-          <w:lang w:bidi="fa-IR"/>
-        </w:rPr>
-        <w:t>0</w:t>
-      </w:r>
-      <w:r>
-        <w:rPr>
-          <w:rFonts w:asciiTheme="minorBidi" w:hAnsiTheme="minorBidi"/>
-          <w:sz w:val="20"/>
-          <w:szCs w:val="20"/>
-          <w:lang w:bidi="fa-IR"/>
-        </w:rPr>
-        <w:t>/100</w:t>
-      </w:r>
-      <w:r>
-        <w:rPr>
-          <w:rFonts w:asciiTheme="minorBidi" w:hAnsiTheme="minorBidi"/>
-          <w:sz w:val="20"/>
-          <w:szCs w:val="20"/>
-          <w:lang w:bidi="fa-IR"/>
-        </w:rPr>
-        <w:t xml:space="preserve"> </w:t>
-      </w:r>
-    </w:p>
-    <w:p>
-      <w:pPr>
-        <w:tabs>
-          <w:tab w:val="left" w:pos="3253"/>
-        </w:tabs>
-        <w:spacing w:line="276" w:lineRule="auto"/>
-        <w:rPr>
-          <w:rFonts w:asciiTheme="minorBidi" w:hAnsiTheme="minorBidi"/>
-          <w:sz w:val="2"/>
-          <w:szCs w:val="2"/>
-          <w:lang w:bidi="fa-IR"/>
-        </w:rPr>
-      </w:pPr>
-    </w:p>
-    <w:p>
-      <w:pPr>
-        <w:tabs>
-          <w:tab w:val="left" w:pos="3253"/>
-        </w:tabs>
-        <w:spacing w:line="276" w:lineRule="auto"/>
-        <w:rPr>
-          <w:rFonts w:asciiTheme="minorBidi" w:hAnsiTheme="minorBidi"/>
-          <w:b/>
-          <w:bCs/>
-          <w:sz w:val="24"/>
-          <w:szCs w:val="24"/>
-          <w:lang w:bidi="fa-IR"/>
-        </w:rPr>
-      </w:pPr>
-      <w:r>
-        <w:rPr>
-          <w:rFonts w:asciiTheme="minorBidi" w:hAnsiTheme="minorBidi"/>
-          <w:b/>
-          <w:bCs/>
-          <w:sz w:val="24"/>
-          <w:szCs w:val="24"/>
-          <w:lang w:bidi="fa-IR"/>
-        </w:rPr>
-        <w:t>LANGUAGE PROFICIENCY</w:t>
-      </w:r>
-    </w:p>
-    <w:p>
-      <w:pPr>
         <w:pStyle w:val="ListParagraph"/>
         <w:numPr>
           <w:ilvl w:val="0"/>
-          <w:numId w:val="4"/>
+          <w:numId w:val="1"/>
         </w:numPr>
         <w:tabs>
-          <w:tab w:val="left" w:pos="3253"/>
+          <w:tab w:val="left" w:pos="1996"/>
         </w:tabs>
-        <w:spacing w:line="276" w:lineRule="auto"/>
         <w:rPr>
           <w:rFonts w:asciiTheme="minorBidi" w:hAnsiTheme="minorBidi"/>
           <w:sz w:val="20"/>
@@ -3861,28 +3684,16 @@
           <w:szCs w:val="20"/>
           <w:lang w:bidi="fa-IR"/>
         </w:rPr>
-        <w:lastRenderedPageBreak/>
-        <w:t>Persian</w:t>
-      </w:r>
-      <w:r>
-        <w:rPr>
-          <w:rFonts w:asciiTheme="minorBidi" w:hAnsiTheme="minorBidi"/>
-          <w:b/>
-          <w:bCs/>
-          <w:sz w:val="20"/>
-          <w:szCs w:val="20"/>
-          <w:lang w:bidi="fa-IR"/>
-        </w:rPr>
-        <w:t xml:space="preserve">: </w:t>
-      </w:r>
-      <w:r>
-        <w:rPr>
-          <w:rFonts w:asciiTheme="minorBidi" w:hAnsiTheme="minorBidi"/>
-          <w:sz w:val="20"/>
-          <w:szCs w:val="20"/>
-          <w:lang w:bidi="fa-IR"/>
-        </w:rPr>
-        <w:t>Native</w:t>
+        <w:t>Languages:</w:t>
+      </w:r>
+      <w:r>
+        <w:rPr>
+          <w:rFonts w:asciiTheme="minorBidi" w:hAnsiTheme="minorBidi"/>
+          <w:sz w:val="20"/>
+          <w:szCs w:val="20"/>
+          <w:lang w:bidi="fa-IR"/>
+        </w:rPr>
+        <w:t xml:space="preserve"> English (IELTS Academic 7), Persian</w:t>
       </w:r>
     </w:p>
     <w:p>
@@ -3890,12 +3701,11 @@
         <w:pStyle w:val="ListParagraph"/>
         <w:numPr>
           <w:ilvl w:val="0"/>
-          <w:numId w:val="4"/>
+          <w:numId w:val="1"/>
         </w:numPr>
         <w:tabs>
-          <w:tab w:val="left" w:pos="3253"/>
+          <w:tab w:val="left" w:pos="1996"/>
         </w:tabs>
-        <w:spacing w:line="276" w:lineRule="auto"/>
         <w:rPr>
           <w:rFonts w:asciiTheme="minorBidi" w:hAnsiTheme="minorBidi"/>
           <w:sz w:val="20"/>
@@ -3912,80 +3722,20 @@
           <w:szCs w:val="20"/>
           <w:lang w:bidi="fa-IR"/>
         </w:rPr>
-        <w:t>English</w:t>
-      </w:r>
-      <w:r>
-        <w:rPr>
-          <w:rFonts w:asciiTheme="minorBidi" w:hAnsiTheme="minorBidi"/>
-          <w:b/>
-          <w:bCs/>
-          <w:sz w:val="20"/>
-          <w:szCs w:val="20"/>
-          <w:lang w:bidi="fa-IR"/>
-        </w:rPr>
-        <w:t>:</w:t>
-      </w:r>
-      <w:r>
-        <w:rPr>
-          <w:rFonts w:asciiTheme="minorBidi" w:hAnsiTheme="minorBidi"/>
-          <w:b/>
-          <w:bCs/>
-          <w:sz w:val="20"/>
-          <w:szCs w:val="20"/>
-          <w:lang w:bidi="fa-IR"/>
-        </w:rPr>
-        <w:t xml:space="preserve"> </w:t>
-      </w:r>
-      <w:r>
-        <w:rPr>
-          <w:rFonts w:asciiTheme="minorBidi" w:hAnsiTheme="minorBidi"/>
-          <w:sz w:val="20"/>
-          <w:szCs w:val="20"/>
-          <w:lang w:bidi="fa-IR"/>
-        </w:rPr>
-        <w:t>IELTS</w:t>
-      </w:r>
-      <w:r>
-        <w:rPr>
-          <w:rFonts w:asciiTheme="minorBidi" w:hAnsiTheme="minorBidi"/>
-          <w:b/>
-          <w:bCs/>
-          <w:sz w:val="20"/>
-          <w:szCs w:val="20"/>
-          <w:lang w:bidi="fa-IR"/>
-        </w:rPr>
-        <w:t xml:space="preserve"> </w:t>
-      </w:r>
-      <w:r>
-        <w:rPr>
-          <w:rFonts w:asciiTheme="minorBidi" w:hAnsiTheme="minorBidi"/>
-          <w:sz w:val="20"/>
-          <w:szCs w:val="20"/>
-          <w:lang w:bidi="fa-IR"/>
-        </w:rPr>
-        <w:t xml:space="preserve">Academic </w:t>
-      </w:r>
-      <w:r>
-        <w:rPr>
-          <w:rFonts w:asciiTheme="minorBidi" w:hAnsiTheme="minorBidi"/>
-          <w:sz w:val="20"/>
-          <w:szCs w:val="20"/>
-          <w:lang w:bidi="fa-IR"/>
-        </w:rPr>
-        <w:t>7</w:t>
-      </w:r>
-      <w:r>
-        <w:rPr>
-          <w:rFonts w:asciiTheme="minorBidi" w:hAnsiTheme="minorBidi"/>
-          <w:sz w:val="20"/>
-          <w:szCs w:val="20"/>
-          <w:lang w:bidi="fa-IR"/>
-        </w:rPr>
-        <w:t xml:space="preserve"> (L:7.5, R:7, W:6, S:6.5)</w:t>
+        <w:t>Interests:</w:t>
+      </w:r>
+      <w:r>
+        <w:rPr>
+          <w:rFonts w:asciiTheme="minorBidi" w:hAnsiTheme="minorBidi"/>
+          <w:sz w:val="20"/>
+          <w:szCs w:val="20"/>
+          <w:lang w:bidi="fa-IR"/>
+        </w:rPr>
+        <w:t xml:space="preserve"> Listening to Podcasts, Strolling, Playing Video Games, Learning French</w:t>
       </w:r>
     </w:p>
     <w:sectPr>
-      <w:footerReference w:type="default" r:id="rId24"/>
+      <w:footerReference w:type="default" r:id="rId18"/>
       <w:pgSz w:w="12240" w:h="15840"/>
       <w:pgMar w:top="1440" w:right="1440" w:bottom="1440" w:left="1440" w:header="720" w:footer="720" w:gutter="0"/>
       <w:pgBorders w:offsetFrom="page">
@@ -4973,6 +4723,121 @@
     </w:lvl>
   </w:abstractNum>
   <w:abstractNum w:abstractNumId="7" w15:restartNumberingAfterBreak="0">
+    <w:nsid w:val="529A19A9"/>
+    <w:multiLevelType w:val="hybridMultilevel"/>
+    <w:tmpl w:val="61488D02"/>
+    <w:lvl w:ilvl="0" w:tplc="ECFE7DD2">
+      <w:start w:val="1"/>
+      <w:numFmt w:val="bullet"/>
+      <w:lvlText w:val=""/>
+      <w:lvlJc w:val="left"/>
+      <w:pPr>
+        <w:ind w:left="720" w:hanging="360"/>
+      </w:pPr>
+      <w:rPr>
+        <w:rFonts w:ascii="Symbol" w:hAnsi="Symbol" w:hint="default"/>
+        <w:sz w:val="20"/>
+        <w:szCs w:val="20"/>
+      </w:rPr>
+    </w:lvl>
+    <w:lvl w:ilvl="1" w:tplc="04090003" w:tentative="1">
+      <w:start w:val="1"/>
+      <w:numFmt w:val="bullet"/>
+      <w:lvlText w:val="o"/>
+      <w:lvlJc w:val="left"/>
+      <w:pPr>
+        <w:ind w:left="1440" w:hanging="360"/>
+      </w:pPr>
+      <w:rPr>
+        <w:rFonts w:ascii="Courier New" w:hAnsi="Courier New" w:cs="Courier New" w:hint="default"/>
+      </w:rPr>
+    </w:lvl>
+    <w:lvl w:ilvl="2" w:tplc="04090005" w:tentative="1">
+      <w:start w:val="1"/>
+      <w:numFmt w:val="bullet"/>
+      <w:lvlText w:val=""/>
+      <w:lvlJc w:val="left"/>
+      <w:pPr>
+        <w:ind w:left="2160" w:hanging="360"/>
+      </w:pPr>
+      <w:rPr>
+        <w:rFonts w:ascii="Wingdings" w:hAnsi="Wingdings" w:hint="default"/>
+      </w:rPr>
+    </w:lvl>
+    <w:lvl w:ilvl="3" w:tplc="04090001" w:tentative="1">
+      <w:start w:val="1"/>
+      <w:numFmt w:val="bullet"/>
+      <w:lvlText w:val=""/>
+      <w:lvlJc w:val="left"/>
+      <w:pPr>
+        <w:ind w:left="2880" w:hanging="360"/>
+      </w:pPr>
+      <w:rPr>
+        <w:rFonts w:ascii="Symbol" w:hAnsi="Symbol" w:hint="default"/>
+      </w:rPr>
+    </w:lvl>
+    <w:lvl w:ilvl="4" w:tplc="04090003" w:tentative="1">
+      <w:start w:val="1"/>
+      <w:numFmt w:val="bullet"/>
+      <w:lvlText w:val="o"/>
+      <w:lvlJc w:val="left"/>
+      <w:pPr>
+        <w:ind w:left="3600" w:hanging="360"/>
+      </w:pPr>
+      <w:rPr>
+        <w:rFonts w:ascii="Courier New" w:hAnsi="Courier New" w:cs="Courier New" w:hint="default"/>
+      </w:rPr>
+    </w:lvl>
+    <w:lvl w:ilvl="5" w:tplc="04090005" w:tentative="1">
+      <w:start w:val="1"/>
+      <w:numFmt w:val="bullet"/>
+      <w:lvlText w:val=""/>
+      <w:lvlJc w:val="left"/>
+      <w:pPr>
+        <w:ind w:left="4320" w:hanging="360"/>
+      </w:pPr>
+      <w:rPr>
+        <w:rFonts w:ascii="Wingdings" w:hAnsi="Wingdings" w:hint="default"/>
+      </w:rPr>
+    </w:lvl>
+    <w:lvl w:ilvl="6" w:tplc="04090001" w:tentative="1">
+      <w:start w:val="1"/>
+      <w:numFmt w:val="bullet"/>
+      <w:lvlText w:val=""/>
+      <w:lvlJc w:val="left"/>
+      <w:pPr>
+        <w:ind w:left="5040" w:hanging="360"/>
+      </w:pPr>
+      <w:rPr>
+        <w:rFonts w:ascii="Symbol" w:hAnsi="Symbol" w:hint="default"/>
+      </w:rPr>
+    </w:lvl>
+    <w:lvl w:ilvl="7" w:tplc="04090003" w:tentative="1">
+      <w:start w:val="1"/>
+      <w:numFmt w:val="bullet"/>
+      <w:lvlText w:val="o"/>
+      <w:lvlJc w:val="left"/>
+      <w:pPr>
+        <w:ind w:left="5760" w:hanging="360"/>
+      </w:pPr>
+      <w:rPr>
+        <w:rFonts w:ascii="Courier New" w:hAnsi="Courier New" w:cs="Courier New" w:hint="default"/>
+      </w:rPr>
+    </w:lvl>
+    <w:lvl w:ilvl="8" w:tplc="04090005" w:tentative="1">
+      <w:start w:val="1"/>
+      <w:numFmt w:val="bullet"/>
+      <w:lvlText w:val=""/>
+      <w:lvlJc w:val="left"/>
+      <w:pPr>
+        <w:ind w:left="6480" w:hanging="360"/>
+      </w:pPr>
+      <w:rPr>
+        <w:rFonts w:ascii="Wingdings" w:hAnsi="Wingdings" w:hint="default"/>
+      </w:rPr>
+    </w:lvl>
+  </w:abstractNum>
+  <w:abstractNum w:abstractNumId="8" w15:restartNumberingAfterBreak="0">
     <w:nsid w:val="63E4684D"/>
     <w:multiLevelType w:val="hybridMultilevel"/>
     <w:tmpl w:val="DA266A96"/>
@@ -5058,7 +4923,7 @@
       </w:pPr>
     </w:lvl>
   </w:abstractNum>
-  <w:abstractNum w:abstractNumId="8" w15:restartNumberingAfterBreak="0">
+  <w:abstractNum w:abstractNumId="9" w15:restartNumberingAfterBreak="0">
     <w:nsid w:val="6A98188D"/>
     <w:multiLevelType w:val="hybridMultilevel"/>
     <w:tmpl w:val="FD7AF12C"/>
@@ -5171,7 +5036,7 @@
       </w:rPr>
     </w:lvl>
   </w:abstractNum>
-  <w:abstractNum w:abstractNumId="9" w15:restartNumberingAfterBreak="0">
+  <w:abstractNum w:abstractNumId="10" w15:restartNumberingAfterBreak="0">
     <w:nsid w:val="6DC55C6F"/>
     <w:multiLevelType w:val="hybridMultilevel"/>
     <w:tmpl w:val="9114288A"/>
@@ -5284,7 +5149,7 @@
       </w:rPr>
     </w:lvl>
   </w:abstractNum>
-  <w:abstractNum w:abstractNumId="10" w15:restartNumberingAfterBreak="0">
+  <w:abstractNum w:abstractNumId="11" w15:restartNumberingAfterBreak="0">
     <w:nsid w:val="6F2B0389"/>
     <w:multiLevelType w:val="hybridMultilevel"/>
     <w:tmpl w:val="502E43C2"/>
@@ -5397,7 +5262,7 @@
       </w:rPr>
     </w:lvl>
   </w:abstractNum>
-  <w:abstractNum w:abstractNumId="11" w15:restartNumberingAfterBreak="0">
+  <w:abstractNum w:abstractNumId="12" w15:restartNumberingAfterBreak="0">
     <w:nsid w:val="75E51B3A"/>
     <w:multiLevelType w:val="hybridMultilevel"/>
     <w:tmpl w:val="7674A95E"/>
@@ -5510,7 +5375,7 @@
       </w:rPr>
     </w:lvl>
   </w:abstractNum>
-  <w:abstractNum w:abstractNumId="12" w15:restartNumberingAfterBreak="0">
+  <w:abstractNum w:abstractNumId="13" w15:restartNumberingAfterBreak="0">
     <w:nsid w:val="76EC1729"/>
     <w:multiLevelType w:val="hybridMultilevel"/>
     <w:tmpl w:val="486A5722"/>
@@ -5623,7 +5488,7 @@
       </w:rPr>
     </w:lvl>
   </w:abstractNum>
-  <w:abstractNum w:abstractNumId="13" w15:restartNumberingAfterBreak="0">
+  <w:abstractNum w:abstractNumId="14" w15:restartNumberingAfterBreak="0">
     <w:nsid w:val="7B485E3A"/>
     <w:multiLevelType w:val="hybridMultilevel"/>
     <w:tmpl w:val="4CDCE6BE"/>
@@ -5743,10 +5608,10 @@
     <w:abstractNumId w:val="2"/>
   </w:num>
   <w:num w:numId="3" w16cid:durableId="1372683249">
-    <w:abstractNumId w:val="8"/>
+    <w:abstractNumId w:val="9"/>
   </w:num>
   <w:num w:numId="4" w16cid:durableId="1218515743">
-    <w:abstractNumId w:val="12"/>
+    <w:abstractNumId w:val="13"/>
   </w:num>
   <w:num w:numId="5" w16cid:durableId="813181568">
     <w:abstractNumId w:val="0"/>
@@ -5755,16 +5620,16 @@
     <w:abstractNumId w:val="3"/>
   </w:num>
   <w:num w:numId="7" w16cid:durableId="972095975">
-    <w:abstractNumId w:val="7"/>
+    <w:abstractNumId w:val="8"/>
   </w:num>
   <w:num w:numId="8" w16cid:durableId="2097549485">
-    <w:abstractNumId w:val="9"/>
+    <w:abstractNumId w:val="10"/>
   </w:num>
   <w:num w:numId="9" w16cid:durableId="1232547508">
     <w:abstractNumId w:val="4"/>
   </w:num>
   <w:num w:numId="10" w16cid:durableId="807741970">
-    <w:abstractNumId w:val="10"/>
+    <w:abstractNumId w:val="11"/>
   </w:num>
   <w:num w:numId="11" w16cid:durableId="1251281186">
     <w:abstractNumId w:val="5"/>
@@ -5773,10 +5638,13 @@
     <w:abstractNumId w:val="6"/>
   </w:num>
   <w:num w:numId="13" w16cid:durableId="356808474">
-    <w:abstractNumId w:val="11"/>
+    <w:abstractNumId w:val="12"/>
   </w:num>
   <w:num w:numId="14" w16cid:durableId="248348570">
-    <w:abstractNumId w:val="13"/>
+    <w:abstractNumId w:val="14"/>
+  </w:num>
+  <w:num w:numId="15" w16cid:durableId="1668551374">
+    <w:abstractNumId w:val="7"/>
   </w:num>
 </w:numbering>
 </file>

</xml_diff>

<commit_message>
Eliminate some extra sections
</commit_message>
<xml_diff>
--- a/static/Omid Reza Heidari-Resume.docx
+++ b/static/Omid Reza Heidari-Resume.docx
@@ -372,113 +372,6 @@
     </w:p>
     <w:p>
       <w:pPr>
-        <w:rPr>
-          <w:rFonts w:asciiTheme="minorBidi" w:hAnsiTheme="minorBidi"/>
-          <w:b/>
-          <w:bCs/>
-          <w:sz w:val="24"/>
-          <w:szCs w:val="24"/>
-        </w:rPr>
-      </w:pPr>
-      <w:r>
-        <w:rPr>
-          <w:rFonts w:asciiTheme="minorBidi" w:hAnsiTheme="minorBidi"/>
-          <w:b/>
-          <w:bCs/>
-          <w:sz w:val="24"/>
-          <w:szCs w:val="24"/>
-        </w:rPr>
-        <w:t>PROFI</w:t>
-      </w:r>
-      <w:r>
-        <w:rPr>
-          <w:rFonts w:asciiTheme="minorBidi" w:hAnsiTheme="minorBidi"/>
-          <w:b/>
-          <w:bCs/>
-          <w:sz w:val="24"/>
-          <w:szCs w:val="24"/>
-        </w:rPr>
-        <w:t>LE</w:t>
-      </w:r>
-    </w:p>
-    <w:p>
-      <w:pPr>
-        <w:spacing w:line="276" w:lineRule="auto"/>
-        <w:rPr>
-          <w:rFonts w:asciiTheme="minorBidi" w:hAnsiTheme="minorBidi"/>
-          <w:sz w:val="20"/>
-          <w:szCs w:val="20"/>
-          <w:lang w:bidi="fa-IR"/>
-        </w:rPr>
-      </w:pPr>
-      <w:r>
-        <w:rPr>
-          <w:rFonts w:asciiTheme="minorBidi" w:hAnsiTheme="minorBidi"/>
-          <w:sz w:val="20"/>
-          <w:szCs w:val="20"/>
-          <w:lang w:bidi="fa-IR"/>
-        </w:rPr>
-        <w:t xml:space="preserve">Hello! I am Omid Reza, a Software Engineer working on web applications, especially the back-end side. I have worked as a freelancer on </w:t>
-      </w:r>
-      <w:r>
-        <w:rPr>
-          <w:rFonts w:asciiTheme="minorBidi" w:hAnsiTheme="minorBidi"/>
-          <w:sz w:val="20"/>
-          <w:szCs w:val="20"/>
-          <w:lang w:bidi="fa-IR"/>
-        </w:rPr>
-        <w:t>2</w:t>
-      </w:r>
-      <w:r>
-        <w:rPr>
-          <w:rFonts w:asciiTheme="minorBidi" w:hAnsiTheme="minorBidi"/>
-          <w:sz w:val="20"/>
-          <w:szCs w:val="20"/>
-          <w:lang w:bidi="fa-IR"/>
-        </w:rPr>
-        <w:t xml:space="preserve"> projects </w:t>
-      </w:r>
-      <w:r>
-        <w:rPr>
-          <w:rFonts w:asciiTheme="minorBidi" w:hAnsiTheme="minorBidi"/>
-          <w:sz w:val="20"/>
-          <w:szCs w:val="20"/>
-          <w:lang w:bidi="fa-IR"/>
-        </w:rPr>
-        <w:t>which</w:t>
-      </w:r>
-      <w:r>
-        <w:rPr>
-          <w:rFonts w:asciiTheme="minorBidi" w:hAnsiTheme="minorBidi"/>
-          <w:sz w:val="20"/>
-          <w:szCs w:val="20"/>
-          <w:lang w:bidi="fa-IR"/>
-        </w:rPr>
-        <w:t xml:space="preserve"> have more than 100,000 installations. I started in tech with several personal projects during my undergraduate studies.</w:t>
-      </w:r>
-    </w:p>
-    <w:p>
-      <w:pPr>
-        <w:spacing w:line="276" w:lineRule="auto"/>
-        <w:rPr>
-          <w:rFonts w:asciiTheme="minorBidi" w:hAnsiTheme="minorBidi"/>
-          <w:sz w:val="20"/>
-          <w:szCs w:val="20"/>
-          <w:lang w:bidi="fa-IR"/>
-        </w:rPr>
-      </w:pPr>
-      <w:r>
-        <w:rPr>
-          <w:rFonts w:asciiTheme="minorBidi" w:hAnsiTheme="minorBidi"/>
-          <w:sz w:val="20"/>
-          <w:szCs w:val="20"/>
-          <w:lang w:bidi="fa-IR"/>
-        </w:rPr>
-        <w:t>Currently studying computer science, and due to my enthusiasm for data-related fields, I chose Artificial intelligence as my concentration during my master’s studies.</w:t>
-      </w:r>
-    </w:p>
-    <w:p>
-      <w:pPr>
         <w:spacing w:line="276" w:lineRule="auto"/>
         <w:rPr>
           <w:rFonts w:asciiTheme="minorBidi" w:hAnsiTheme="minorBidi"/>
@@ -582,6 +475,8 @@
           <w:rPr>
             <w:rStyle w:val="Hyperlink"/>
             <w:rFonts w:asciiTheme="minorBidi" w:hAnsiTheme="minorBidi"/>
+            <w:b/>
+            <w:bCs/>
             <w:color w:val="1F3864" w:themeColor="accent1" w:themeShade="80"/>
             <w:sz w:val="20"/>
             <w:szCs w:val="20"/>
@@ -1182,6 +1077,8 @@
       <w:r>
         <w:rPr>
           <w:rFonts w:asciiTheme="minorBidi" w:hAnsiTheme="minorBidi"/>
+          <w:b/>
+          <w:bCs/>
           <w:sz w:val="20"/>
           <w:szCs w:val="20"/>
           <w:lang w:bidi="fa-IR"/>
@@ -1461,25 +1358,7 @@
           <w:sz w:val="20"/>
           <w:szCs w:val="20"/>
         </w:rPr>
-        <w:t xml:space="preserve">, and thus, the support contacting </w:t>
-      </w:r>
-      <w:r>
-        <w:rPr>
-          <w:rStyle w:val="hgkelc"/>
-          <w:rFonts w:asciiTheme="minorBidi" w:hAnsiTheme="minorBidi"/>
-          <w:sz w:val="20"/>
-          <w:szCs w:val="20"/>
-        </w:rPr>
-        <w:t>rate</w:t>
-      </w:r>
-      <w:r>
-        <w:rPr>
-          <w:rStyle w:val="hgkelc"/>
-          <w:rFonts w:asciiTheme="minorBidi" w:hAnsiTheme="minorBidi"/>
-          <w:sz w:val="20"/>
-          <w:szCs w:val="20"/>
-        </w:rPr>
-        <w:t xml:space="preserve"> that was about inquiring</w:t>
+        <w:t>, and thus, the support contacting rate that was about inquiring</w:t>
       </w:r>
       <w:r>
         <w:rPr>
@@ -1539,7 +1418,16 @@
           <w:sz w:val="20"/>
           <w:szCs w:val="20"/>
         </w:rPr>
-        <w:t xml:space="preserve">Coded </w:t>
+        <w:t>Implement</w:t>
+      </w:r>
+      <w:r>
+        <w:rPr>
+          <w:rStyle w:val="hgkelc"/>
+          <w:rFonts w:asciiTheme="minorBidi" w:hAnsiTheme="minorBidi"/>
+          <w:sz w:val="20"/>
+          <w:szCs w:val="20"/>
+        </w:rPr>
+        <w:t xml:space="preserve">ed </w:t>
       </w:r>
       <w:r>
         <w:rPr>
@@ -2113,7 +2001,6 @@
           <w:szCs w:val="20"/>
           <w:lang w:bidi="fa-IR"/>
         </w:rPr>
-        <w:lastRenderedPageBreak/>
         <w:t xml:space="preserve">The project has been </w:t>
       </w:r>
       <w:r>
@@ -2613,25 +2500,79 @@
           <w:szCs w:val="20"/>
           <w:lang w:bidi="fa-IR"/>
         </w:rPr>
-        <w:t xml:space="preserve">The project has been </w:t>
-      </w:r>
-      <w:r>
-        <w:rPr>
-          <w:rFonts w:asciiTheme="minorBidi" w:hAnsiTheme="minorBidi"/>
-          <w:sz w:val="20"/>
-          <w:szCs w:val="20"/>
-          <w:lang w:bidi="fa-IR"/>
-        </w:rPr>
-        <w:t>coded</w:t>
-      </w:r>
-      <w:r>
-        <w:rPr>
-          <w:rFonts w:asciiTheme="minorBidi" w:hAnsiTheme="minorBidi"/>
-          <w:sz w:val="20"/>
-          <w:szCs w:val="20"/>
-          <w:lang w:bidi="fa-IR"/>
-        </w:rPr>
-        <w:t xml:space="preserve"> on PHP, Vue.js, and Bootstrap</w:t>
+        <w:t xml:space="preserve">The </w:t>
+      </w:r>
+      <w:r>
+        <w:rPr>
+          <w:rFonts w:asciiTheme="minorBidi" w:hAnsiTheme="minorBidi"/>
+          <w:sz w:val="20"/>
+          <w:szCs w:val="20"/>
+          <w:lang w:bidi="fa-IR"/>
+        </w:rPr>
+        <w:t>product</w:t>
+      </w:r>
+      <w:r>
+        <w:rPr>
+          <w:rFonts w:asciiTheme="minorBidi" w:hAnsiTheme="minorBidi"/>
+          <w:sz w:val="20"/>
+          <w:szCs w:val="20"/>
+          <w:lang w:bidi="fa-IR"/>
+        </w:rPr>
+        <w:t xml:space="preserve"> has been </w:t>
+      </w:r>
+      <w:r>
+        <w:rPr>
+          <w:rFonts w:asciiTheme="minorBidi" w:hAnsiTheme="minorBidi"/>
+          <w:sz w:val="20"/>
+          <w:szCs w:val="20"/>
+          <w:lang w:bidi="fa-IR"/>
+        </w:rPr>
+        <w:t xml:space="preserve">produced via </w:t>
+      </w:r>
+      <w:r>
+        <w:rPr>
+          <w:rFonts w:asciiTheme="minorBidi" w:hAnsiTheme="minorBidi"/>
+          <w:sz w:val="20"/>
+          <w:szCs w:val="20"/>
+          <w:lang w:bidi="fa-IR"/>
+        </w:rPr>
+        <w:t>PHP</w:t>
+      </w:r>
+      <w:r>
+        <w:rPr>
+          <w:rFonts w:asciiTheme="minorBidi" w:hAnsiTheme="minorBidi"/>
+          <w:sz w:val="20"/>
+          <w:szCs w:val="20"/>
+          <w:lang w:bidi="fa-IR"/>
+        </w:rPr>
+        <w:t xml:space="preserve">, </w:t>
+      </w:r>
+      <w:r>
+        <w:rPr>
+          <w:rFonts w:asciiTheme="minorBidi" w:hAnsiTheme="minorBidi"/>
+          <w:sz w:val="20"/>
+          <w:szCs w:val="20"/>
+          <w:lang w:bidi="fa-IR"/>
+        </w:rPr>
+        <w:t>Vue.js</w:t>
+      </w:r>
+      <w:r>
+        <w:rPr>
+          <w:rFonts w:asciiTheme="minorBidi" w:hAnsiTheme="minorBidi"/>
+          <w:sz w:val="20"/>
+          <w:szCs w:val="20"/>
+          <w:lang w:bidi="fa-IR"/>
+        </w:rPr>
+        <w:t xml:space="preserve">, </w:t>
+      </w:r>
+      <w:r>
+        <w:rPr>
+          <w:rFonts w:asciiTheme="minorBidi" w:hAnsiTheme="minorBidi"/>
+          <w:sz w:val="20"/>
+          <w:szCs w:val="20"/>
+          <w:lang w:bidi="fa-IR"/>
+        </w:rPr>
+        <w:t>and Bootstrap</w:t>
       </w:r>
     </w:p>
     <w:p>
@@ -2647,48 +2588,110 @@
         <w:spacing w:line="240" w:lineRule="auto"/>
         <w:rPr>
           <w:rFonts w:asciiTheme="minorBidi" w:hAnsiTheme="minorBidi"/>
-          <w:b/>
-          <w:bCs/>
-          <w:sz w:val="20"/>
-          <w:szCs w:val="20"/>
-          <w:lang w:bidi="fa-IR"/>
-        </w:rPr>
-      </w:pPr>
-      <w:r>
-        <w:rPr>
-          <w:rFonts w:asciiTheme="minorBidi" w:hAnsiTheme="minorBidi"/>
-          <w:sz w:val="20"/>
-          <w:szCs w:val="20"/>
-          <w:lang w:bidi="fa-IR"/>
-        </w:rPr>
-        <w:t xml:space="preserve">The </w:t>
-      </w:r>
-      <w:r>
-        <w:rPr>
-          <w:rFonts w:asciiTheme="minorBidi" w:hAnsiTheme="minorBidi"/>
-          <w:sz w:val="20"/>
-          <w:szCs w:val="20"/>
-          <w:lang w:bidi="fa-IR"/>
-        </w:rPr>
-        <w:t>project support</w:t>
-      </w:r>
-      <w:r>
-        <w:rPr>
-          <w:rFonts w:asciiTheme="minorBidi" w:hAnsiTheme="minorBidi"/>
-          <w:sz w:val="20"/>
-          <w:szCs w:val="20"/>
-          <w:lang w:bidi="fa-IR"/>
-        </w:rPr>
-        <w:t>s</w:t>
-      </w:r>
-      <w:r>
-        <w:rPr>
-          <w:rFonts w:asciiTheme="minorBidi" w:hAnsiTheme="minorBidi"/>
-          <w:sz w:val="20"/>
-          <w:szCs w:val="20"/>
-          <w:lang w:bidi="fa-IR"/>
-        </w:rPr>
-        <w:t xml:space="preserve"> multiple servers at a time</w:t>
+          <w:sz w:val="20"/>
+          <w:szCs w:val="20"/>
+          <w:lang w:bidi="fa-IR"/>
+        </w:rPr>
+      </w:pPr>
+      <w:r>
+        <w:rPr>
+          <w:rFonts w:asciiTheme="minorBidi" w:hAnsiTheme="minorBidi"/>
+          <w:sz w:val="20"/>
+          <w:szCs w:val="20"/>
+          <w:lang w:bidi="fa-IR"/>
+        </w:rPr>
+        <w:lastRenderedPageBreak/>
+        <w:t>A few revisions</w:t>
+      </w:r>
+      <w:r>
+        <w:rPr>
+          <w:rFonts w:asciiTheme="minorBidi" w:hAnsiTheme="minorBidi"/>
+          <w:sz w:val="20"/>
+          <w:szCs w:val="20"/>
+          <w:lang w:bidi="fa-IR"/>
+        </w:rPr>
+        <w:t xml:space="preserve"> have been made in order to fix some bugs</w:t>
+      </w:r>
+      <w:r>
+        <w:rPr>
+          <w:rFonts w:asciiTheme="minorBidi" w:hAnsiTheme="minorBidi"/>
+          <w:sz w:val="20"/>
+          <w:szCs w:val="20"/>
+          <w:lang w:bidi="fa-IR"/>
+        </w:rPr>
+        <w:t xml:space="preserve"> and </w:t>
+      </w:r>
+      <w:r>
+        <w:rPr>
+          <w:rFonts w:asciiTheme="minorBidi" w:hAnsiTheme="minorBidi"/>
+          <w:sz w:val="20"/>
+          <w:szCs w:val="20"/>
+          <w:lang w:bidi="fa-IR"/>
+        </w:rPr>
+        <w:t>add</w:t>
+      </w:r>
+      <w:r>
+        <w:rPr>
+          <w:rFonts w:asciiTheme="minorBidi" w:hAnsiTheme="minorBidi"/>
+          <w:sz w:val="20"/>
+          <w:szCs w:val="20"/>
+          <w:lang w:bidi="fa-IR"/>
+        </w:rPr>
+        <w:t xml:space="preserve"> </w:t>
+      </w:r>
+      <w:r>
+        <w:rPr>
+          <w:rFonts w:asciiTheme="minorBidi" w:hAnsiTheme="minorBidi"/>
+          <w:sz w:val="20"/>
+          <w:szCs w:val="20"/>
+          <w:lang w:bidi="fa-IR"/>
+        </w:rPr>
+        <w:t xml:space="preserve">the </w:t>
+      </w:r>
+      <w:r>
+        <w:rPr>
+          <w:rFonts w:asciiTheme="minorBidi" w:hAnsiTheme="minorBidi"/>
+          <w:sz w:val="20"/>
+          <w:szCs w:val="20"/>
+          <w:lang w:bidi="fa-IR"/>
+        </w:rPr>
+        <w:t>multi</w:t>
+      </w:r>
+      <w:r>
+        <w:rPr>
+          <w:rFonts w:asciiTheme="minorBidi" w:hAnsiTheme="minorBidi"/>
+          <w:sz w:val="20"/>
+          <w:szCs w:val="20"/>
+          <w:lang w:bidi="fa-IR"/>
+        </w:rPr>
+        <w:t>-</w:t>
+      </w:r>
+      <w:r>
+        <w:rPr>
+          <w:rFonts w:asciiTheme="minorBidi" w:hAnsiTheme="minorBidi"/>
+          <w:sz w:val="20"/>
+          <w:szCs w:val="20"/>
+          <w:lang w:bidi="fa-IR"/>
+        </w:rPr>
+        <w:t xml:space="preserve">language </w:t>
+      </w:r>
+      <w:r>
+        <w:rPr>
+          <w:rFonts w:asciiTheme="minorBidi" w:hAnsiTheme="minorBidi"/>
+          <w:sz w:val="20"/>
+          <w:szCs w:val="20"/>
+          <w:lang w:bidi="fa-IR"/>
+        </w:rPr>
+        <w:t xml:space="preserve">feature </w:t>
+      </w:r>
+      <w:r>
+        <w:rPr>
+          <w:rFonts w:asciiTheme="minorBidi" w:hAnsiTheme="minorBidi"/>
+          <w:sz w:val="20"/>
+          <w:szCs w:val="20"/>
+          <w:lang w:bidi="fa-IR"/>
+        </w:rPr>
+        <w:t>for a better user experience</w:t>
       </w:r>
     </w:p>
     <w:p>
@@ -3693,7 +3696,52 @@
           <w:szCs w:val="20"/>
           <w:lang w:bidi="fa-IR"/>
         </w:rPr>
-        <w:t xml:space="preserve"> English (IELTS Academic 7), Persian</w:t>
+        <w:t xml:space="preserve"> </w:t>
+      </w:r>
+      <w:r>
+        <w:rPr>
+          <w:rFonts w:asciiTheme="minorBidi" w:hAnsiTheme="minorBidi"/>
+          <w:sz w:val="20"/>
+          <w:szCs w:val="20"/>
+          <w:lang w:bidi="fa-IR"/>
+        </w:rPr>
+        <w:t xml:space="preserve">Fluent in </w:t>
+      </w:r>
+      <w:r>
+        <w:rPr>
+          <w:rFonts w:asciiTheme="minorBidi" w:hAnsiTheme="minorBidi"/>
+          <w:sz w:val="20"/>
+          <w:szCs w:val="20"/>
+          <w:lang w:bidi="fa-IR"/>
+        </w:rPr>
+        <w:t>English (IELTS Academic 7)</w:t>
+      </w:r>
+      <w:r>
+        <w:rPr>
+          <w:rFonts w:asciiTheme="minorBidi" w:hAnsiTheme="minorBidi"/>
+          <w:sz w:val="20"/>
+          <w:szCs w:val="20"/>
+          <w:lang w:bidi="fa-IR"/>
+        </w:rPr>
+        <w:t>; Native</w:t>
+      </w:r>
+      <w:r>
+        <w:rPr>
+          <w:rFonts w:asciiTheme="minorBidi" w:hAnsiTheme="minorBidi"/>
+          <w:sz w:val="20"/>
+          <w:szCs w:val="20"/>
+          <w:lang w:bidi="fa-IR"/>
+        </w:rPr>
+        <w:t xml:space="preserve"> Persian</w:t>
+      </w:r>
+      <w:r>
+        <w:rPr>
+          <w:rFonts w:asciiTheme="minorBidi" w:hAnsiTheme="minorBidi"/>
+          <w:sz w:val="20"/>
+          <w:szCs w:val="20"/>
+          <w:lang w:bidi="fa-IR"/>
+        </w:rPr>
+        <w:t xml:space="preserve"> Speaker</w:t>
       </w:r>
     </w:p>
     <w:p>
@@ -5498,7 +5546,7 @@
       <w:lvlText w:val=""/>
       <w:lvlJc w:val="left"/>
       <w:pPr>
-        <w:ind w:left="2714" w:hanging="360"/>
+        <w:ind w:left="720" w:hanging="360"/>
       </w:pPr>
       <w:rPr>
         <w:rFonts w:ascii="Symbol" w:hAnsi="Symbol" w:hint="default"/>
@@ -5510,7 +5558,7 @@
       <w:lvlText w:val="o"/>
       <w:lvlJc w:val="left"/>
       <w:pPr>
-        <w:ind w:left="3434" w:hanging="360"/>
+        <w:ind w:left="1440" w:hanging="360"/>
       </w:pPr>
       <w:rPr>
         <w:rFonts w:ascii="Courier New" w:hAnsi="Courier New" w:cs="Courier New" w:hint="default"/>
@@ -5522,7 +5570,7 @@
       <w:lvlText w:val=""/>
       <w:lvlJc w:val="left"/>
       <w:pPr>
-        <w:ind w:left="4154" w:hanging="360"/>
+        <w:ind w:left="2160" w:hanging="360"/>
       </w:pPr>
       <w:rPr>
         <w:rFonts w:ascii="Wingdings" w:hAnsi="Wingdings" w:hint="default"/>
@@ -5534,7 +5582,7 @@
       <w:lvlText w:val=""/>
       <w:lvlJc w:val="left"/>
       <w:pPr>
-        <w:ind w:left="4874" w:hanging="360"/>
+        <w:ind w:left="2880" w:hanging="360"/>
       </w:pPr>
       <w:rPr>
         <w:rFonts w:ascii="Symbol" w:hAnsi="Symbol" w:hint="default"/>
@@ -5546,7 +5594,7 @@
       <w:lvlText w:val="o"/>
       <w:lvlJc w:val="left"/>
       <w:pPr>
-        <w:ind w:left="5594" w:hanging="360"/>
+        <w:ind w:left="3600" w:hanging="360"/>
       </w:pPr>
       <w:rPr>
         <w:rFonts w:ascii="Courier New" w:hAnsi="Courier New" w:cs="Courier New" w:hint="default"/>
@@ -5558,7 +5606,7 @@
       <w:lvlText w:val=""/>
       <w:lvlJc w:val="left"/>
       <w:pPr>
-        <w:ind w:left="6314" w:hanging="360"/>
+        <w:ind w:left="4320" w:hanging="360"/>
       </w:pPr>
       <w:rPr>
         <w:rFonts w:ascii="Wingdings" w:hAnsi="Wingdings" w:hint="default"/>
@@ -5570,7 +5618,7 @@
       <w:lvlText w:val=""/>
       <w:lvlJc w:val="left"/>
       <w:pPr>
-        <w:ind w:left="7034" w:hanging="360"/>
+        <w:ind w:left="5040" w:hanging="360"/>
       </w:pPr>
       <w:rPr>
         <w:rFonts w:ascii="Symbol" w:hAnsi="Symbol" w:hint="default"/>
@@ -5582,7 +5630,7 @@
       <w:lvlText w:val="o"/>
       <w:lvlJc w:val="left"/>
       <w:pPr>
-        <w:ind w:left="7754" w:hanging="360"/>
+        <w:ind w:left="5760" w:hanging="360"/>
       </w:pPr>
       <w:rPr>
         <w:rFonts w:ascii="Courier New" w:hAnsi="Courier New" w:cs="Courier New" w:hint="default"/>
@@ -5594,7 +5642,7 @@
       <w:lvlText w:val=""/>
       <w:lvlJc w:val="left"/>
       <w:pPr>
-        <w:ind w:left="8474" w:hanging="360"/>
+        <w:ind w:left="6480" w:hanging="360"/>
       </w:pPr>
       <w:rPr>
         <w:rFonts w:ascii="Wingdings" w:hAnsi="Wingdings" w:hint="default"/>

</xml_diff>